<commit_message>
Agregacion de capturas al Documento Word ,evidencias.
</commit_message>
<xml_diff>
--- a/LG14 - INVESTIGACIÓN Y DESPLIEGUE DE UN REPOSITORIO BIG DATA CON DOCKER.docx
+++ b/LG14 - INVESTIGACIÓN Y DESPLIEGUE DE UN REPOSITORIO BIG DATA CON DOCKER.docx
@@ -201,6 +201,7 @@
       <w:r>
         <w:rPr>
           <w:rFonts w:ascii="Times New Roman" w:hAnsi="Times New Roman" w:cs="Times New Roman"/>
+          <w:noProof/>
         </w:rPr>
         <w:drawing>
           <wp:inline distT="0" distB="0" distL="0" distR="0" wp14:anchorId="7880D9E2" wp14:editId="5EDFA3A2">
@@ -275,7 +276,7 @@
           <w:noProof/>
           <w:lang w:val="es-BO"/>
         </w:rPr>
-        <w:t>ESTUDIANTE</w:t>
+        <w:t>ESTUDIANTES: </w:t>
       </w:r>
       <w:r>
         <w:rPr>
@@ -285,8 +286,26 @@
           <w:noProof/>
           <w:lang w:val="es-BO"/>
         </w:rPr>
-        <w:t>S</w:t>
-      </w:r>
+        <w:tab/>
+      </w:r>
+      <w:r>
+        <w:rPr>
+          <w:rFonts w:ascii="Times New Roman" w:hAnsi="Times New Roman" w:cs="Times New Roman"/>
+          <w:noProof/>
+          <w:lang w:val="es-BO"/>
+        </w:rPr>
+        <w:t>Jhael Elisa Guevara Silva</w:t>
+      </w:r>
+    </w:p>
+    <w:p>
+      <w:pPr>
+        <w:ind w:left="1416"/>
+        <w:rPr>
+          <w:rFonts w:ascii="Times New Roman" w:hAnsi="Times New Roman" w:cs="Times New Roman"/>
+          <w:noProof/>
+          <w:lang w:val="es-BO"/>
+        </w:rPr>
+      </w:pPr>
       <w:r>
         <w:rPr>
           <w:rFonts w:ascii="Times New Roman" w:hAnsi="Times New Roman" w:cs="Times New Roman"/>
@@ -295,7 +314,7 @@
           <w:noProof/>
           <w:lang w:val="es-BO"/>
         </w:rPr>
-        <w:t>: </w:t>
+        <w:tab/>
       </w:r>
       <w:r>
         <w:rPr>
@@ -310,24 +329,6 @@
       <w:r>
         <w:rPr>
           <w:rFonts w:ascii="Times New Roman" w:hAnsi="Times New Roman" w:cs="Times New Roman"/>
-          <w:noProof/>
-          <w:lang w:val="es-BO"/>
-        </w:rPr>
-        <w:t>Jhael Elisa Guevara Silva</w:t>
-      </w:r>
-    </w:p>
-    <w:p>
-      <w:pPr>
-        <w:ind w:left="1416"/>
-        <w:rPr>
-          <w:rFonts w:ascii="Times New Roman" w:hAnsi="Times New Roman" w:cs="Times New Roman"/>
-          <w:noProof/>
-          <w:lang w:val="es-BO"/>
-        </w:rPr>
-      </w:pPr>
-      <w:r>
-        <w:rPr>
-          <w:rFonts w:ascii="Times New Roman" w:hAnsi="Times New Roman" w:cs="Times New Roman"/>
           <w:b/>
           <w:bCs/>
           <w:noProof/>
@@ -348,30 +349,124 @@
       <w:r>
         <w:rPr>
           <w:rFonts w:ascii="Times New Roman" w:hAnsi="Times New Roman" w:cs="Times New Roman"/>
+          <w:noProof/>
+          <w:lang w:val="es-BO"/>
+        </w:rPr>
+        <w:t xml:space="preserve">Johnny Suarez Abasto </w:t>
+      </w:r>
+    </w:p>
+    <w:p>
+      <w:pPr>
+        <w:ind w:left="1416"/>
+        <w:rPr>
+          <w:rFonts w:ascii="Times New Roman" w:hAnsi="Times New Roman" w:cs="Times New Roman"/>
+          <w:noProof/>
+          <w:lang w:val="es-BO"/>
+        </w:rPr>
+      </w:pPr>
+      <w:r>
+        <w:rPr>
+          <w:rFonts w:ascii="Times New Roman" w:hAnsi="Times New Roman" w:cs="Times New Roman"/>
+          <w:noProof/>
+          <w:lang w:val="es-BO"/>
+        </w:rPr>
+        <w:tab/>
+      </w:r>
+      <w:r>
+        <w:rPr>
+          <w:rFonts w:ascii="Times New Roman" w:hAnsi="Times New Roman" w:cs="Times New Roman"/>
+          <w:noProof/>
+          <w:lang w:val="es-BO"/>
+        </w:rPr>
+        <w:tab/>
+      </w:r>
+      <w:r>
+        <w:rPr>
+          <w:rFonts w:ascii="Times New Roman" w:hAnsi="Times New Roman" w:cs="Times New Roman"/>
+          <w:noProof/>
+          <w:lang w:val="es-BO"/>
+        </w:rPr>
+        <w:tab/>
+      </w:r>
+      <w:r>
+        <w:rPr>
+          <w:rFonts w:ascii="Times New Roman" w:hAnsi="Times New Roman" w:cs="Times New Roman"/>
+          <w:noProof/>
+          <w:lang w:val="es-BO"/>
+        </w:rPr>
+        <w:tab/>
+        <w:t>Samir Limachi Lopez</w:t>
+      </w:r>
+    </w:p>
+    <w:p>
+      <w:pPr>
+        <w:ind w:left="1416"/>
+        <w:rPr>
+          <w:rFonts w:ascii="Times New Roman" w:hAnsi="Times New Roman" w:cs="Times New Roman"/>
+        </w:rPr>
+      </w:pPr>
+      <w:r>
+        <w:rPr>
+          <w:rFonts w:ascii="Times New Roman" w:hAnsi="Times New Roman" w:cs="Times New Roman"/>
           <w:b/>
           <w:bCs/>
           <w:noProof/>
           <w:lang w:val="es-BO"/>
         </w:rPr>
-        <w:tab/>
-      </w:r>
+        <w:t xml:space="preserve">CÓDIGO: </w:t>
+      </w:r>
+      <w:r>
+        <w:rPr>
+          <w:rFonts w:ascii="Times New Roman" w:hAnsi="Times New Roman" w:cs="Times New Roman"/>
+        </w:rPr>
+        <w:t xml:space="preserve">LG14 - investigación y despliegue de un repositorio </w:t>
+      </w:r>
+      <w:proofErr w:type="spellStart"/>
+      <w:r>
+        <w:rPr>
+          <w:rFonts w:ascii="Times New Roman" w:hAnsi="Times New Roman" w:cs="Times New Roman"/>
+        </w:rPr>
+        <w:t>big</w:t>
+      </w:r>
+      <w:proofErr w:type="spellEnd"/>
+      <w:r>
+        <w:rPr>
+          <w:rFonts w:ascii="Times New Roman" w:hAnsi="Times New Roman" w:cs="Times New Roman"/>
+        </w:rPr>
+        <w:t xml:space="preserve"> data con </w:t>
+      </w:r>
+      <w:proofErr w:type="spellStart"/>
+      <w:r>
+        <w:rPr>
+          <w:rFonts w:ascii="Times New Roman" w:hAnsi="Times New Roman" w:cs="Times New Roman"/>
+        </w:rPr>
+        <w:t>docker</w:t>
+      </w:r>
+      <w:proofErr w:type="spellEnd"/>
+    </w:p>
+    <w:p>
+      <w:pPr>
+        <w:ind w:left="1416"/>
+        <w:rPr>
+          <w:rFonts w:ascii="Times New Roman" w:hAnsi="Times New Roman" w:cs="Times New Roman"/>
+          <w:noProof/>
+        </w:rPr>
+      </w:pPr>
       <w:r>
         <w:rPr>
           <w:rFonts w:ascii="Times New Roman" w:hAnsi="Times New Roman" w:cs="Times New Roman"/>
           <w:b/>
           <w:bCs/>
           <w:noProof/>
-          <w:lang w:val="es-BO"/>
-        </w:rPr>
-        <w:tab/>
+        </w:rPr>
+        <w:t>MATERIA:</w:t>
       </w:r>
       <w:r>
         <w:rPr>
           <w:rFonts w:ascii="Times New Roman" w:hAnsi="Times New Roman" w:cs="Times New Roman"/>
           <w:noProof/>
-          <w:lang w:val="es-BO"/>
-        </w:rPr>
-        <w:t xml:space="preserve">Johnny Suarez Abasto </w:t>
+        </w:rPr>
+        <w:t> Tecnologías Emergentes</w:t>
       </w:r>
     </w:p>
     <w:p>
@@ -380,48 +475,6 @@
         <w:rPr>
           <w:rFonts w:ascii="Times New Roman" w:hAnsi="Times New Roman" w:cs="Times New Roman"/>
           <w:noProof/>
-          <w:lang w:val="es-BO"/>
-        </w:rPr>
-      </w:pPr>
-      <w:r>
-        <w:rPr>
-          <w:rFonts w:ascii="Times New Roman" w:hAnsi="Times New Roman" w:cs="Times New Roman"/>
-          <w:noProof/>
-          <w:lang w:val="es-BO"/>
-        </w:rPr>
-        <w:tab/>
-      </w:r>
-      <w:r>
-        <w:rPr>
-          <w:rFonts w:ascii="Times New Roman" w:hAnsi="Times New Roman" w:cs="Times New Roman"/>
-          <w:noProof/>
-          <w:lang w:val="es-BO"/>
-        </w:rPr>
-        <w:tab/>
-      </w:r>
-      <w:r>
-        <w:rPr>
-          <w:rFonts w:ascii="Times New Roman" w:hAnsi="Times New Roman" w:cs="Times New Roman"/>
-          <w:noProof/>
-          <w:lang w:val="es-BO"/>
-        </w:rPr>
-        <w:tab/>
-      </w:r>
-      <w:r>
-        <w:rPr>
-          <w:rFonts w:ascii="Times New Roman" w:hAnsi="Times New Roman" w:cs="Times New Roman"/>
-          <w:noProof/>
-          <w:lang w:val="es-BO"/>
-        </w:rPr>
-        <w:tab/>
-        <w:t>Samir Limachi Lopez</w:t>
-      </w:r>
-    </w:p>
-    <w:p>
-      <w:pPr>
-        <w:ind w:left="1416"/>
-        <w:rPr>
-          <w:rFonts w:ascii="Times New Roman" w:hAnsi="Times New Roman" w:cs="Times New Roman"/>
         </w:rPr>
       </w:pPr>
       <w:r>
@@ -430,21 +483,15 @@
           <w:b/>
           <w:bCs/>
           <w:noProof/>
-          <w:lang w:val="es-BO"/>
-        </w:rPr>
-        <w:t xml:space="preserve">CÓDIGO: </w:t>
-      </w:r>
-      <w:r>
-        <w:rPr>
-          <w:rFonts w:ascii="Times New Roman" w:hAnsi="Times New Roman" w:cs="Times New Roman"/>
-        </w:rPr>
-        <w:t xml:space="preserve">LG14 - </w:t>
-      </w:r>
-      <w:r>
-        <w:rPr>
-          <w:rFonts w:ascii="Times New Roman" w:hAnsi="Times New Roman" w:cs="Times New Roman"/>
-        </w:rPr>
-        <w:t>investigación y despliegue de un repositorio big data con docker</w:t>
+        </w:rPr>
+        <w:t>GRUPO: </w:t>
+      </w:r>
+      <w:r>
+        <w:rPr>
+          <w:rFonts w:ascii="Times New Roman" w:hAnsi="Times New Roman" w:cs="Times New Roman"/>
+          <w:noProof/>
+        </w:rPr>
+        <w:t>“A”</w:t>
       </w:r>
     </w:p>
     <w:p>
@@ -462,64 +509,28 @@
           <w:bCs/>
           <w:noProof/>
         </w:rPr>
-        <w:t>MATERIA:</w:t>
+        <w:t>DOCENTE: </w:t>
       </w:r>
       <w:r>
         <w:rPr>
           <w:rFonts w:ascii="Times New Roman" w:hAnsi="Times New Roman" w:cs="Times New Roman"/>
           <w:noProof/>
         </w:rPr>
-        <w:t> Tecnologías Emergentes</w:t>
-      </w:r>
-    </w:p>
-    <w:p>
-      <w:pPr>
-        <w:ind w:left="1416"/>
+        <w:t xml:space="preserve">Ing. Efrain </w:t>
+      </w:r>
+      <w:r>
         <w:rPr>
           <w:rFonts w:ascii="Times New Roman" w:hAnsi="Times New Roman" w:cs="Times New Roman"/>
           <w:noProof/>
         </w:rPr>
-      </w:pPr>
-      <w:r>
-        <w:rPr>
-          <w:rFonts w:ascii="Times New Roman" w:hAnsi="Times New Roman" w:cs="Times New Roman"/>
-          <w:b/>
-          <w:bCs/>
+        <w:t>L</w:t>
+      </w:r>
+      <w:r>
+        <w:rPr>
+          <w:rFonts w:ascii="Times New Roman" w:hAnsi="Times New Roman" w:cs="Times New Roman"/>
           <w:noProof/>
         </w:rPr>
-        <w:t>GRUPO: </w:t>
-      </w:r>
-      <w:r>
-        <w:rPr>
-          <w:rFonts w:ascii="Times New Roman" w:hAnsi="Times New Roman" w:cs="Times New Roman"/>
-          <w:noProof/>
-        </w:rPr>
-        <w:t>“A”</w:t>
-      </w:r>
-    </w:p>
-    <w:p>
-      <w:pPr>
-        <w:ind w:left="1416"/>
-        <w:rPr>
-          <w:rFonts w:ascii="Times New Roman" w:hAnsi="Times New Roman" w:cs="Times New Roman"/>
-          <w:noProof/>
-        </w:rPr>
-      </w:pPr>
-      <w:r>
-        <w:rPr>
-          <w:rFonts w:ascii="Times New Roman" w:hAnsi="Times New Roman" w:cs="Times New Roman"/>
-          <w:b/>
-          <w:bCs/>
-          <w:noProof/>
-        </w:rPr>
-        <w:t>DOCENTE: </w:t>
-      </w:r>
-      <w:r>
-        <w:rPr>
-          <w:rFonts w:ascii="Times New Roman" w:hAnsi="Times New Roman" w:cs="Times New Roman"/>
-          <w:noProof/>
-        </w:rPr>
-        <w:t>Ing. Efrain Eluna Mamani</w:t>
+        <w:t>una Mamani</w:t>
       </w:r>
     </w:p>
     <w:p>
@@ -836,7 +847,21 @@
         <w:rPr>
           <w:rFonts w:ascii="Times New Roman" w:hAnsi="Times New Roman" w:cs="Times New Roman"/>
         </w:rPr>
-        <w:t>Utilizar Docker, Docker Compose o contenedores.</w:t>
+        <w:t xml:space="preserve">Utilizar Docker, Docker </w:t>
+      </w:r>
+      <w:proofErr w:type="spellStart"/>
+      <w:r>
+        <w:rPr>
+          <w:rFonts w:ascii="Times New Roman" w:hAnsi="Times New Roman" w:cs="Times New Roman"/>
+        </w:rPr>
+        <w:t>Compose</w:t>
+      </w:r>
+      <w:proofErr w:type="spellEnd"/>
+      <w:r>
+        <w:rPr>
+          <w:rFonts w:ascii="Times New Roman" w:hAnsi="Times New Roman" w:cs="Times New Roman"/>
+        </w:rPr>
+        <w:t xml:space="preserve"> o contenedores.</w:t>
       </w:r>
     </w:p>
     <w:p>
@@ -1054,7 +1079,21 @@
         <w:rPr>
           <w:rFonts w:ascii="Times New Roman" w:hAnsi="Times New Roman" w:cs="Times New Roman"/>
         </w:rPr>
-        <w:t>Cambiar solamente el nombre de una carpeta o hacer una copia/fork y presentarlo como proyecto diferente.</w:t>
+        <w:t>Cambiar solamente el nombre de una carpeta o hacer una copia/</w:t>
+      </w:r>
+      <w:proofErr w:type="spellStart"/>
+      <w:r>
+        <w:rPr>
+          <w:rFonts w:ascii="Times New Roman" w:hAnsi="Times New Roman" w:cs="Times New Roman"/>
+        </w:rPr>
+        <w:t>fork</w:t>
+      </w:r>
+      <w:proofErr w:type="spellEnd"/>
+      <w:r>
+        <w:rPr>
+          <w:rFonts w:ascii="Times New Roman" w:hAnsi="Times New Roman" w:cs="Times New Roman"/>
+        </w:rPr>
+        <w:t xml:space="preserve"> y presentarlo como proyecto diferente.</w:t>
       </w:r>
     </w:p>
     <w:p>
@@ -1286,7 +1325,21 @@
         <w:rPr>
           <w:rFonts w:ascii="Times New Roman" w:hAnsi="Times New Roman" w:cs="Times New Roman"/>
         </w:rPr>
-        <w:t xml:space="preserve"> Entorno Docker Compose para ejecutar Apache Spark con almacenamiento distribuido.</w:t>
+        <w:t xml:space="preserve"> Entorno Docker </w:t>
+      </w:r>
+      <w:proofErr w:type="spellStart"/>
+      <w:r>
+        <w:rPr>
+          <w:rFonts w:ascii="Times New Roman" w:hAnsi="Times New Roman" w:cs="Times New Roman"/>
+        </w:rPr>
+        <w:t>Compose</w:t>
+      </w:r>
+      <w:proofErr w:type="spellEnd"/>
+      <w:r>
+        <w:rPr>
+          <w:rFonts w:ascii="Times New Roman" w:hAnsi="Times New Roman" w:cs="Times New Roman"/>
+        </w:rPr>
+        <w:t xml:space="preserve"> para ejecutar Apache Spark con almacenamiento distribuido.</w:t>
       </w:r>
     </w:p>
     <w:p>
@@ -1362,8 +1415,30 @@
         <w:rPr>
           <w:rFonts w:ascii="Times New Roman" w:hAnsi="Times New Roman" w:cs="Times New Roman"/>
         </w:rPr>
-        <w:t xml:space="preserve"> Elgoh/DockerSpark</w:t>
-      </w:r>
+        <w:t xml:space="preserve"> </w:t>
+      </w:r>
+      <w:proofErr w:type="spellStart"/>
+      <w:r>
+        <w:rPr>
+          <w:rFonts w:ascii="Times New Roman" w:hAnsi="Times New Roman" w:cs="Times New Roman"/>
+        </w:rPr>
+        <w:t>Elgoh</w:t>
+      </w:r>
+      <w:proofErr w:type="spellEnd"/>
+      <w:r>
+        <w:rPr>
+          <w:rFonts w:ascii="Times New Roman" w:hAnsi="Times New Roman" w:cs="Times New Roman"/>
+        </w:rPr>
+        <w:t>/</w:t>
+      </w:r>
+      <w:proofErr w:type="spellStart"/>
+      <w:r>
+        <w:rPr>
+          <w:rFonts w:ascii="Times New Roman" w:hAnsi="Times New Roman" w:cs="Times New Roman"/>
+        </w:rPr>
+        <w:t>DockerSpark</w:t>
+      </w:r>
+      <w:proofErr w:type="spellEnd"/>
     </w:p>
     <w:p>
       <w:pPr>
@@ -1398,23 +1473,7 @@
             <w:rFonts w:ascii="Times New Roman" w:hAnsi="Times New Roman" w:cs="Times New Roman"/>
             <w:lang w:val="en-US"/>
           </w:rPr>
-          <w:t>https://github.com/Elgoh/Dock</w:t>
-        </w:r>
-        <w:r>
-          <w:rPr>
-            <w:rStyle w:val="Hipervnculo"/>
-            <w:rFonts w:ascii="Times New Roman" w:hAnsi="Times New Roman" w:cs="Times New Roman"/>
-            <w:lang w:val="en-US"/>
-          </w:rPr>
-          <w:t>e</w:t>
-        </w:r>
-        <w:r>
-          <w:rPr>
-            <w:rStyle w:val="Hipervnculo"/>
-            <w:rFonts w:ascii="Times New Roman" w:hAnsi="Times New Roman" w:cs="Times New Roman"/>
-            <w:lang w:val="en-US"/>
-          </w:rPr>
-          <w:t>rSpark</w:t>
+          <w:t>https://github.com/Elgoh/DockerSpark</w:t>
         </w:r>
       </w:hyperlink>
     </w:p>
@@ -1439,7 +1498,21 @@
         <w:rPr>
           <w:rFonts w:ascii="Times New Roman" w:hAnsi="Times New Roman" w:cs="Times New Roman"/>
         </w:rPr>
-        <w:t xml:space="preserve"> Elgoh (usuario de GitHub)</w:t>
+        <w:t xml:space="preserve"> </w:t>
+      </w:r>
+      <w:proofErr w:type="spellStart"/>
+      <w:r>
+        <w:rPr>
+          <w:rFonts w:ascii="Times New Roman" w:hAnsi="Times New Roman" w:cs="Times New Roman"/>
+        </w:rPr>
+        <w:t>Elgoh</w:t>
+      </w:r>
+      <w:proofErr w:type="spellEnd"/>
+      <w:r>
+        <w:rPr>
+          <w:rFonts w:ascii="Times New Roman" w:hAnsi="Times New Roman" w:cs="Times New Roman"/>
+        </w:rPr>
+        <w:t xml:space="preserve"> (usuario de GitHub)</w:t>
       </w:r>
     </w:p>
     <w:p>
@@ -1463,7 +1536,35 @@
         <w:rPr>
           <w:rFonts w:ascii="Times New Roman" w:hAnsi="Times New Roman" w:cs="Times New Roman"/>
         </w:rPr>
-        <w:t>Clúster Big Data con Apache Spark, Hadoop, Hive y YARN desplegado con Docker Compose para almacenamiento HDFS y procesamiento distribuido.</w:t>
+        <w:t xml:space="preserve">Clúster Big Data con Apache Spark, Hadoop, </w:t>
+      </w:r>
+      <w:proofErr w:type="spellStart"/>
+      <w:r>
+        <w:rPr>
+          <w:rFonts w:ascii="Times New Roman" w:hAnsi="Times New Roman" w:cs="Times New Roman"/>
+        </w:rPr>
+        <w:t>Hive</w:t>
+      </w:r>
+      <w:proofErr w:type="spellEnd"/>
+      <w:r>
+        <w:rPr>
+          <w:rFonts w:ascii="Times New Roman" w:hAnsi="Times New Roman" w:cs="Times New Roman"/>
+        </w:rPr>
+        <w:t xml:space="preserve"> y YARN desplegado con Docker </w:t>
+      </w:r>
+      <w:proofErr w:type="spellStart"/>
+      <w:r>
+        <w:rPr>
+          <w:rFonts w:ascii="Times New Roman" w:hAnsi="Times New Roman" w:cs="Times New Roman"/>
+        </w:rPr>
+        <w:t>Compose</w:t>
+      </w:r>
+      <w:proofErr w:type="spellEnd"/>
+      <w:r>
+        <w:rPr>
+          <w:rFonts w:ascii="Times New Roman" w:hAnsi="Times New Roman" w:cs="Times New Roman"/>
+        </w:rPr>
+        <w:t xml:space="preserve"> para almacenamiento HDFS y procesamiento distribuido.</w:t>
       </w:r>
     </w:p>
     <w:p>
@@ -1720,7 +1821,21 @@
         <w:rPr>
           <w:rFonts w:ascii="Times New Roman" w:hAnsi="Times New Roman" w:cs="Times New Roman"/>
         </w:rPr>
-        <w:t>Número de forks.</w:t>
+        <w:t xml:space="preserve">Número de </w:t>
+      </w:r>
+      <w:proofErr w:type="spellStart"/>
+      <w:r>
+        <w:rPr>
+          <w:rFonts w:ascii="Times New Roman" w:hAnsi="Times New Roman" w:cs="Times New Roman"/>
+        </w:rPr>
+        <w:t>forks</w:t>
+      </w:r>
+      <w:proofErr w:type="spellEnd"/>
+      <w:r>
+        <w:rPr>
+          <w:rFonts w:ascii="Times New Roman" w:hAnsi="Times New Roman" w:cs="Times New Roman"/>
+        </w:rPr>
+        <w:t>.</w:t>
       </w:r>
     </w:p>
     <w:p>
@@ -1846,12 +1961,14 @@
                 <w:rFonts w:ascii="Times New Roman" w:hAnsi="Times New Roman" w:cs="Times New Roman"/>
               </w:rPr>
             </w:pPr>
+            <w:proofErr w:type="spellStart"/>
             <w:r>
               <w:rPr>
                 <w:rFonts w:ascii="Times New Roman" w:hAnsi="Times New Roman" w:cs="Times New Roman"/>
               </w:rPr>
               <w:t>DockerSpark</w:t>
             </w:r>
+            <w:proofErr w:type="spellEnd"/>
           </w:p>
         </w:tc>
       </w:tr>
@@ -1889,11 +2006,19 @@
                 <w:rFonts w:ascii="Times New Roman" w:hAnsi="Times New Roman" w:cs="Times New Roman"/>
               </w:rPr>
             </w:pPr>
-            <w:r>
-              <w:rPr>
-                <w:rFonts w:ascii="Times New Roman" w:hAnsi="Times New Roman" w:cs="Times New Roman"/>
-              </w:rPr>
-              <w:t>Elgoh (usuario de GitHub)</w:t>
+            <w:proofErr w:type="spellStart"/>
+            <w:r>
+              <w:rPr>
+                <w:rFonts w:ascii="Times New Roman" w:hAnsi="Times New Roman" w:cs="Times New Roman"/>
+              </w:rPr>
+              <w:t>Elgoh</w:t>
+            </w:r>
+            <w:proofErr w:type="spellEnd"/>
+            <w:r>
+              <w:rPr>
+                <w:rFonts w:ascii="Times New Roman" w:hAnsi="Times New Roman" w:cs="Times New Roman"/>
+              </w:rPr>
+              <w:t xml:space="preserve"> (usuario de GitHub)</w:t>
             </w:r>
           </w:p>
         </w:tc>
@@ -2102,8 +2227,17 @@
                 <w:rStyle w:val="Fuerte"/>
                 <w:rFonts w:ascii="Times New Roman" w:hAnsi="Times New Roman" w:cs="Times New Roman"/>
               </w:rPr>
-              <w:t>Número de forks</w:t>
-            </w:r>
+              <w:t xml:space="preserve">Número de </w:t>
+            </w:r>
+            <w:proofErr w:type="spellStart"/>
+            <w:r>
+              <w:rPr>
+                <w:rStyle w:val="Fuerte"/>
+                <w:rFonts w:ascii="Times New Roman" w:hAnsi="Times New Roman" w:cs="Times New Roman"/>
+              </w:rPr>
+              <w:t>forks</w:t>
+            </w:r>
+            <w:proofErr w:type="spellEnd"/>
           </w:p>
         </w:tc>
         <w:tc>
@@ -2173,7 +2307,21 @@
               <w:rPr>
                 <w:rFonts w:ascii="Times New Roman" w:hAnsi="Times New Roman" w:cs="Times New Roman"/>
               </w:rPr>
-              <w:t xml:space="preserve"> El repositorio no incluye un archivo LICENSE ni declara una licencia en la sección "About" (lado derecho).</w:t>
+              <w:t xml:space="preserve"> El repositorio no incluye un archivo LICENSE ni declara una licencia en la sección "</w:t>
+            </w:r>
+            <w:proofErr w:type="spellStart"/>
+            <w:r>
+              <w:rPr>
+                <w:rFonts w:ascii="Times New Roman" w:hAnsi="Times New Roman" w:cs="Times New Roman"/>
+              </w:rPr>
+              <w:t>About</w:t>
+            </w:r>
+            <w:proofErr w:type="spellEnd"/>
+            <w:r>
+              <w:rPr>
+                <w:rFonts w:ascii="Times New Roman" w:hAnsi="Times New Roman" w:cs="Times New Roman"/>
+              </w:rPr>
+              <w:t>" (lado derecho).</w:t>
             </w:r>
           </w:p>
         </w:tc>
@@ -2216,7 +2364,49 @@
               <w:rPr>
                 <w:rFonts w:ascii="Times New Roman" w:hAnsi="Times New Roman" w:cs="Times New Roman"/>
               </w:rPr>
-              <w:t>Proporcionar un entorno contenedorizado para Apache Spark, Apache Hive y Apache Hadoop YARN usando Docker, permitiendo el despliegue local de un clúster Big Data completo para almacenamiento (HDFS) y procesamiento distribuido (Spark, YARN, Hive).</w:t>
+              <w:t xml:space="preserve">Proporcionar un entorno </w:t>
+            </w:r>
+            <w:proofErr w:type="spellStart"/>
+            <w:r>
+              <w:rPr>
+                <w:rFonts w:ascii="Times New Roman" w:hAnsi="Times New Roman" w:cs="Times New Roman"/>
+              </w:rPr>
+              <w:t>contenedorizado</w:t>
+            </w:r>
+            <w:proofErr w:type="spellEnd"/>
+            <w:r>
+              <w:rPr>
+                <w:rFonts w:ascii="Times New Roman" w:hAnsi="Times New Roman" w:cs="Times New Roman"/>
+              </w:rPr>
+              <w:t xml:space="preserve"> para Apache Spark, Apache </w:t>
+            </w:r>
+            <w:proofErr w:type="spellStart"/>
+            <w:r>
+              <w:rPr>
+                <w:rFonts w:ascii="Times New Roman" w:hAnsi="Times New Roman" w:cs="Times New Roman"/>
+              </w:rPr>
+              <w:t>Hive</w:t>
+            </w:r>
+            <w:proofErr w:type="spellEnd"/>
+            <w:r>
+              <w:rPr>
+                <w:rFonts w:ascii="Times New Roman" w:hAnsi="Times New Roman" w:cs="Times New Roman"/>
+              </w:rPr>
+              <w:t xml:space="preserve"> y Apache Hadoop YARN usando Docker, permitiendo el despliegue local de un clúster Big Data completo para almacenamiento (HDFS) y procesamiento distribuido (Spark, YARN, </w:t>
+            </w:r>
+            <w:proofErr w:type="spellStart"/>
+            <w:r>
+              <w:rPr>
+                <w:rFonts w:ascii="Times New Roman" w:hAnsi="Times New Roman" w:cs="Times New Roman"/>
+              </w:rPr>
+              <w:t>Hive</w:t>
+            </w:r>
+            <w:proofErr w:type="spellEnd"/>
+            <w:r>
+              <w:rPr>
+                <w:rFonts w:ascii="Times New Roman" w:hAnsi="Times New Roman" w:cs="Times New Roman"/>
+              </w:rPr>
+              <w:t>).</w:t>
             </w:r>
           </w:p>
         </w:tc>
@@ -2625,7 +2815,21 @@
         <w:rPr>
           <w:rFonts w:ascii="Times New Roman" w:hAnsi="Times New Roman" w:cs="Times New Roman"/>
         </w:rPr>
-        <w:t>Docker Compose.</w:t>
+        <w:t xml:space="preserve">Docker </w:t>
+      </w:r>
+      <w:proofErr w:type="spellStart"/>
+      <w:r>
+        <w:rPr>
+          <w:rFonts w:ascii="Times New Roman" w:hAnsi="Times New Roman" w:cs="Times New Roman"/>
+        </w:rPr>
+        <w:t>Compose</w:t>
+      </w:r>
+      <w:proofErr w:type="spellEnd"/>
+      <w:r>
+        <w:rPr>
+          <w:rFonts w:ascii="Times New Roman" w:hAnsi="Times New Roman" w:cs="Times New Roman"/>
+        </w:rPr>
+        <w:t>.</w:t>
       </w:r>
     </w:p>
     <w:p>
@@ -2676,11 +2880,19 @@
           <w:rFonts w:ascii="Times New Roman" w:hAnsi="Times New Roman" w:cs="Times New Roman"/>
         </w:rPr>
       </w:pPr>
-      <w:r>
-        <w:rPr>
-          <w:rFonts w:ascii="Times New Roman" w:hAnsi="Times New Roman" w:cs="Times New Roman"/>
-        </w:rPr>
-        <w:t>Frameworks adicionales.</w:t>
+      <w:proofErr w:type="spellStart"/>
+      <w:r>
+        <w:rPr>
+          <w:rFonts w:ascii="Times New Roman" w:hAnsi="Times New Roman" w:cs="Times New Roman"/>
+        </w:rPr>
+        <w:t>Frameworks</w:t>
+      </w:r>
+      <w:proofErr w:type="spellEnd"/>
+      <w:r>
+        <w:rPr>
+          <w:rFonts w:ascii="Times New Roman" w:hAnsi="Times New Roman" w:cs="Times New Roman"/>
+        </w:rPr>
+        <w:t xml:space="preserve"> adicionales.</w:t>
       </w:r>
     </w:p>
     <w:p>
@@ -2932,8 +3144,19 @@
                 <w:bCs/>
                 <w:lang w:val="es-ES"/>
               </w:rPr>
-              <w:t>Versión de Hive</w:t>
-            </w:r>
+              <w:t xml:space="preserve">Versión de </w:t>
+            </w:r>
+            <w:proofErr w:type="spellStart"/>
+            <w:r>
+              <w:rPr>
+                <w:rFonts w:ascii="Times New Roman" w:hAnsi="Times New Roman" w:cs="Times New Roman"/>
+                <w:b/>
+                <w:bCs/>
+                <w:lang w:val="es-ES"/>
+              </w:rPr>
+              <w:t>Hive</w:t>
+            </w:r>
+            <w:proofErr w:type="spellEnd"/>
           </w:p>
         </w:tc>
         <w:tc>
@@ -3005,7 +3228,23 @@
                 <w:rFonts w:ascii="Times New Roman" w:hAnsi="Times New Roman" w:cs="Times New Roman"/>
                 <w:lang w:val="es-ES"/>
               </w:rPr>
-              <w:t>Sí. Se utiliza Docker Engine 20.10.0 o superior.</w:t>
+              <w:t xml:space="preserve">Sí. Se utiliza Docker </w:t>
+            </w:r>
+            <w:proofErr w:type="spellStart"/>
+            <w:r>
+              <w:rPr>
+                <w:rFonts w:ascii="Times New Roman" w:hAnsi="Times New Roman" w:cs="Times New Roman"/>
+                <w:lang w:val="es-ES"/>
+              </w:rPr>
+              <w:t>Engine</w:t>
+            </w:r>
+            <w:proofErr w:type="spellEnd"/>
+            <w:r>
+              <w:rPr>
+                <w:rFonts w:ascii="Times New Roman" w:hAnsi="Times New Roman" w:cs="Times New Roman"/>
+                <w:lang w:val="es-ES"/>
+              </w:rPr>
+              <w:t xml:space="preserve"> 20.10.0 o superior.</w:t>
             </w:r>
           </w:p>
         </w:tc>
@@ -3032,8 +3271,19 @@
                 <w:bCs/>
                 <w:lang w:val="es-ES"/>
               </w:rPr>
-              <w:t>Docker Compose</w:t>
-            </w:r>
+              <w:t xml:space="preserve">Docker </w:t>
+            </w:r>
+            <w:proofErr w:type="spellStart"/>
+            <w:r>
+              <w:rPr>
+                <w:rFonts w:ascii="Times New Roman" w:hAnsi="Times New Roman" w:cs="Times New Roman"/>
+                <w:b/>
+                <w:bCs/>
+                <w:lang w:val="es-ES"/>
+              </w:rPr>
+              <w:t>Compose</w:t>
+            </w:r>
+            <w:proofErr w:type="spellEnd"/>
           </w:p>
         </w:tc>
         <w:tc>
@@ -3055,7 +3305,23 @@
                 <w:rFonts w:ascii="Times New Roman" w:hAnsi="Times New Roman" w:cs="Times New Roman"/>
                 <w:lang w:val="es-ES"/>
               </w:rPr>
-              <w:t>Sí. Versión 2.0.0 o superior. El archivo docker-compose.yml define todos los servicios.</w:t>
+              <w:t xml:space="preserve">Sí. Versión 2.0.0 o superior. El archivo </w:t>
+            </w:r>
+            <w:proofErr w:type="spellStart"/>
+            <w:r>
+              <w:rPr>
+                <w:rFonts w:ascii="Times New Roman" w:hAnsi="Times New Roman" w:cs="Times New Roman"/>
+                <w:lang w:val="es-ES"/>
+              </w:rPr>
+              <w:t>docker-compose.yml</w:t>
+            </w:r>
+            <w:proofErr w:type="spellEnd"/>
+            <w:r>
+              <w:rPr>
+                <w:rFonts w:ascii="Times New Roman" w:hAnsi="Times New Roman" w:cs="Times New Roman"/>
+                <w:lang w:val="es-ES"/>
+              </w:rPr>
+              <w:t xml:space="preserve"> define todos los servicios.</w:t>
             </w:r>
           </w:p>
         </w:tc>
@@ -3150,12 +3416,53 @@
                 <w:lang w:val="es-ES"/>
               </w:rPr>
             </w:pPr>
-            <w:r>
-              <w:rPr>
-                <w:rFonts w:ascii="Times New Roman" w:hAnsi="Times New Roman" w:cs="Times New Roman"/>
-                <w:lang w:val="es-ES"/>
-              </w:rPr>
-              <w:t>Hive Metastore (almacén de metadatos para Hive). No se incluye una base de datos relacional externa en la configuración por defecto.</w:t>
+            <w:proofErr w:type="spellStart"/>
+            <w:r>
+              <w:rPr>
+                <w:rFonts w:ascii="Times New Roman" w:hAnsi="Times New Roman" w:cs="Times New Roman"/>
+                <w:lang w:val="es-ES"/>
+              </w:rPr>
+              <w:t>Hive</w:t>
+            </w:r>
+            <w:proofErr w:type="spellEnd"/>
+            <w:r>
+              <w:rPr>
+                <w:rFonts w:ascii="Times New Roman" w:hAnsi="Times New Roman" w:cs="Times New Roman"/>
+                <w:lang w:val="es-ES"/>
+              </w:rPr>
+              <w:t xml:space="preserve"> </w:t>
+            </w:r>
+            <w:proofErr w:type="spellStart"/>
+            <w:r>
+              <w:rPr>
+                <w:rFonts w:ascii="Times New Roman" w:hAnsi="Times New Roman" w:cs="Times New Roman"/>
+                <w:lang w:val="es-ES"/>
+              </w:rPr>
+              <w:t>Metastore</w:t>
+            </w:r>
+            <w:proofErr w:type="spellEnd"/>
+            <w:r>
+              <w:rPr>
+                <w:rFonts w:ascii="Times New Roman" w:hAnsi="Times New Roman" w:cs="Times New Roman"/>
+                <w:lang w:val="es-ES"/>
+              </w:rPr>
+              <w:t xml:space="preserve"> (almacén de metadatos para </w:t>
+            </w:r>
+            <w:proofErr w:type="spellStart"/>
+            <w:r>
+              <w:rPr>
+                <w:rFonts w:ascii="Times New Roman" w:hAnsi="Times New Roman" w:cs="Times New Roman"/>
+                <w:lang w:val="es-ES"/>
+              </w:rPr>
+              <w:t>Hive</w:t>
+            </w:r>
+            <w:proofErr w:type="spellEnd"/>
+            <w:r>
+              <w:rPr>
+                <w:rFonts w:ascii="Times New Roman" w:hAnsi="Times New Roman" w:cs="Times New Roman"/>
+                <w:lang w:val="es-ES"/>
+              </w:rPr>
+              <w:t>). No se incluye una base de datos relacional externa en la configuración por defecto.</w:t>
             </w:r>
           </w:p>
         </w:tc>
@@ -3175,6 +3482,7 @@
                 <w:lang w:val="es-ES"/>
               </w:rPr>
             </w:pPr>
+            <w:proofErr w:type="spellStart"/>
             <w:r>
               <w:rPr>
                 <w:rFonts w:ascii="Times New Roman" w:hAnsi="Times New Roman" w:cs="Times New Roman"/>
@@ -3182,7 +3490,17 @@
                 <w:bCs/>
                 <w:lang w:val="es-ES"/>
               </w:rPr>
-              <w:t>Frameworks adicionales</w:t>
+              <w:t>Frameworks</w:t>
+            </w:r>
+            <w:proofErr w:type="spellEnd"/>
+            <w:r>
+              <w:rPr>
+                <w:rFonts w:ascii="Times New Roman" w:hAnsi="Times New Roman" w:cs="Times New Roman"/>
+                <w:b/>
+                <w:bCs/>
+                <w:lang w:val="es-ES"/>
+              </w:rPr>
+              <w:t xml:space="preserve"> adicionales</w:t>
             </w:r>
           </w:p>
         </w:tc>
@@ -3205,7 +3523,23 @@
                 <w:rFonts w:ascii="Times New Roman" w:hAnsi="Times New Roman" w:cs="Times New Roman"/>
                 <w:lang w:val="es-ES"/>
               </w:rPr>
-              <w:t>Hadoop YARN (gestión de recursos), HDFS (sistema de archivos distribuido), Hive (consultas SQL).</w:t>
+              <w:t xml:space="preserve">Hadoop YARN (gestión de recursos), HDFS (sistema de archivos distribuido), </w:t>
+            </w:r>
+            <w:proofErr w:type="spellStart"/>
+            <w:r>
+              <w:rPr>
+                <w:rFonts w:ascii="Times New Roman" w:hAnsi="Times New Roman" w:cs="Times New Roman"/>
+                <w:lang w:val="es-ES"/>
+              </w:rPr>
+              <w:t>Hive</w:t>
+            </w:r>
+            <w:proofErr w:type="spellEnd"/>
+            <w:r>
+              <w:rPr>
+                <w:rFonts w:ascii="Times New Roman" w:hAnsi="Times New Roman" w:cs="Times New Roman"/>
+                <w:lang w:val="es-ES"/>
+              </w:rPr>
+              <w:t xml:space="preserve"> (consultas SQL).</w:t>
             </w:r>
           </w:p>
         </w:tc>
@@ -3255,7 +3589,39 @@
                 <w:rFonts w:ascii="Times New Roman" w:hAnsi="Times New Roman" w:cs="Times New Roman"/>
                 <w:lang w:val="es-ES"/>
               </w:rPr>
-              <w:t>Principalmente Python (para aplicaciones Spark), SQL (para Hive y Spark SQL). El proyecto incluye scripts de shell para inicialización.</w:t>
+              <w:t xml:space="preserve">Principalmente Python (para aplicaciones Spark), SQL (para </w:t>
+            </w:r>
+            <w:proofErr w:type="spellStart"/>
+            <w:r>
+              <w:rPr>
+                <w:rFonts w:ascii="Times New Roman" w:hAnsi="Times New Roman" w:cs="Times New Roman"/>
+                <w:lang w:val="es-ES"/>
+              </w:rPr>
+              <w:t>Hive</w:t>
+            </w:r>
+            <w:proofErr w:type="spellEnd"/>
+            <w:r>
+              <w:rPr>
+                <w:rFonts w:ascii="Times New Roman" w:hAnsi="Times New Roman" w:cs="Times New Roman"/>
+                <w:lang w:val="es-ES"/>
+              </w:rPr>
+              <w:t xml:space="preserve"> y Spark SQL). El proyecto incluye scripts de </w:t>
+            </w:r>
+            <w:proofErr w:type="spellStart"/>
+            <w:r>
+              <w:rPr>
+                <w:rFonts w:ascii="Times New Roman" w:hAnsi="Times New Roman" w:cs="Times New Roman"/>
+                <w:lang w:val="es-ES"/>
+              </w:rPr>
+              <w:t>shell</w:t>
+            </w:r>
+            <w:proofErr w:type="spellEnd"/>
+            <w:r>
+              <w:rPr>
+                <w:rFonts w:ascii="Times New Roman" w:hAnsi="Times New Roman" w:cs="Times New Roman"/>
+                <w:lang w:val="es-ES"/>
+              </w:rPr>
+              <w:t xml:space="preserve"> para inicialización.</w:t>
             </w:r>
           </w:p>
         </w:tc>
@@ -3305,7 +3671,23 @@
           <w:rFonts w:ascii="Times New Roman" w:hAnsi="Times New Roman" w:cs="Times New Roman"/>
           <w:lang w:val="es-ES"/>
         </w:rPr>
-        <w:t>Docker Engine 20.10.0 o posterior.</w:t>
+        <w:t xml:space="preserve">Docker </w:t>
+      </w:r>
+      <w:proofErr w:type="spellStart"/>
+      <w:r>
+        <w:rPr>
+          <w:rFonts w:ascii="Times New Roman" w:hAnsi="Times New Roman" w:cs="Times New Roman"/>
+          <w:lang w:val="es-ES"/>
+        </w:rPr>
+        <w:t>Engine</w:t>
+      </w:r>
+      <w:proofErr w:type="spellEnd"/>
+      <w:r>
+        <w:rPr>
+          <w:rFonts w:ascii="Times New Roman" w:hAnsi="Times New Roman" w:cs="Times New Roman"/>
+          <w:lang w:val="es-ES"/>
+        </w:rPr>
+        <w:t xml:space="preserve"> 20.10.0 o posterior.</w:t>
       </w:r>
     </w:p>
     <w:p>
@@ -3326,7 +3708,23 @@
           <w:rFonts w:ascii="Times New Roman" w:hAnsi="Times New Roman" w:cs="Times New Roman"/>
           <w:lang w:val="es-ES"/>
         </w:rPr>
-        <w:t>Docker Compose v2.0.0 o posterior.</w:t>
+        <w:t xml:space="preserve">Docker </w:t>
+      </w:r>
+      <w:proofErr w:type="spellStart"/>
+      <w:r>
+        <w:rPr>
+          <w:rFonts w:ascii="Times New Roman" w:hAnsi="Times New Roman" w:cs="Times New Roman"/>
+          <w:lang w:val="es-ES"/>
+        </w:rPr>
+        <w:t>Compose</w:t>
+      </w:r>
+      <w:proofErr w:type="spellEnd"/>
+      <w:r>
+        <w:rPr>
+          <w:rFonts w:ascii="Times New Roman" w:hAnsi="Times New Roman" w:cs="Times New Roman"/>
+          <w:lang w:val="es-ES"/>
+        </w:rPr>
+        <w:t xml:space="preserve"> v2.0.0 o posterior.</w:t>
       </w:r>
     </w:p>
     <w:p>
@@ -3708,7 +4106,23 @@
           <w:rFonts w:ascii="Times New Roman" w:hAnsi="Times New Roman" w:cs="Times New Roman"/>
           <w:lang w:val="es-ES"/>
         </w:rPr>
-        <w:t xml:space="preserve"> en el archivo docker-compose.yml:</w:t>
+        <w:t xml:space="preserve"> en el archivo </w:t>
+      </w:r>
+      <w:proofErr w:type="spellStart"/>
+      <w:r>
+        <w:rPr>
+          <w:rFonts w:ascii="Times New Roman" w:hAnsi="Times New Roman" w:cs="Times New Roman"/>
+          <w:lang w:val="es-ES"/>
+        </w:rPr>
+        <w:t>docker-compose.yml</w:t>
+      </w:r>
+      <w:proofErr w:type="spellEnd"/>
+      <w:r>
+        <w:rPr>
+          <w:rFonts w:ascii="Times New Roman" w:hAnsi="Times New Roman" w:cs="Times New Roman"/>
+          <w:lang w:val="es-ES"/>
+        </w:rPr>
+        <w:t>:</w:t>
       </w:r>
     </w:p>
     <w:p>
@@ -3723,6 +4137,7 @@
           <w:lang w:val="es-ES"/>
         </w:rPr>
       </w:pPr>
+      <w:proofErr w:type="spellStart"/>
       <w:r>
         <w:rPr>
           <w:rFonts w:ascii="Times New Roman" w:hAnsi="Times New Roman" w:cs="Times New Roman"/>
@@ -3730,6 +4145,7 @@
         </w:rPr>
         <w:t>yarn-resourcemanager</w:t>
       </w:r>
+      <w:proofErr w:type="spellEnd"/>
     </w:p>
     <w:p>
       <w:pPr>
@@ -3743,6 +4159,7 @@
           <w:lang w:val="es-ES"/>
         </w:rPr>
       </w:pPr>
+      <w:proofErr w:type="spellStart"/>
       <w:r>
         <w:rPr>
           <w:rFonts w:ascii="Times New Roman" w:hAnsi="Times New Roman" w:cs="Times New Roman"/>
@@ -3750,6 +4167,7 @@
         </w:rPr>
         <w:t>yarn-nodemanager</w:t>
       </w:r>
+      <w:proofErr w:type="spellEnd"/>
     </w:p>
     <w:p>
       <w:pPr>
@@ -3763,13 +4181,31 @@
           <w:lang w:val="es-ES"/>
         </w:rPr>
       </w:pPr>
+      <w:proofErr w:type="spellStart"/>
       <w:r>
         <w:rPr>
           <w:rFonts w:ascii="Times New Roman" w:hAnsi="Times New Roman" w:cs="Times New Roman"/>
           <w:lang w:val="es-ES"/>
         </w:rPr>
-        <w:t>spark-master</w:t>
-      </w:r>
+        <w:t>spark</w:t>
+      </w:r>
+      <w:proofErr w:type="spellEnd"/>
+      <w:r>
+        <w:rPr>
+          <w:rFonts w:ascii="Times New Roman" w:hAnsi="Times New Roman" w:cs="Times New Roman"/>
+          <w:lang w:val="es-ES"/>
+        </w:rPr>
+        <w:t>-</w:t>
+      </w:r>
+      <w:proofErr w:type="gramStart"/>
+      <w:r>
+        <w:rPr>
+          <w:rFonts w:ascii="Times New Roman" w:hAnsi="Times New Roman" w:cs="Times New Roman"/>
+          <w:lang w:val="es-ES"/>
+        </w:rPr>
+        <w:t>master</w:t>
+      </w:r>
+      <w:proofErr w:type="gramEnd"/>
     </w:p>
     <w:p>
       <w:pPr>
@@ -3783,6 +4219,7 @@
           <w:lang w:val="es-ES"/>
         </w:rPr>
       </w:pPr>
+      <w:proofErr w:type="spellStart"/>
       <w:r>
         <w:rPr>
           <w:rFonts w:ascii="Times New Roman" w:hAnsi="Times New Roman" w:cs="Times New Roman"/>
@@ -3790,6 +4227,7 @@
         </w:rPr>
         <w:t>spark-worker</w:t>
       </w:r>
+      <w:proofErr w:type="spellEnd"/>
     </w:p>
     <w:p>
       <w:pPr>
@@ -3803,6 +4241,7 @@
           <w:lang w:val="es-ES"/>
         </w:rPr>
       </w:pPr>
+      <w:proofErr w:type="spellStart"/>
       <w:r>
         <w:rPr>
           <w:rFonts w:ascii="Times New Roman" w:hAnsi="Times New Roman" w:cs="Times New Roman"/>
@@ -3810,6 +4249,7 @@
         </w:rPr>
         <w:t>hive-metastore</w:t>
       </w:r>
+      <w:proofErr w:type="spellEnd"/>
     </w:p>
     <w:p>
       <w:pPr>
@@ -3823,12 +4263,21 @@
           <w:lang w:val="es-ES"/>
         </w:rPr>
       </w:pPr>
+      <w:proofErr w:type="spellStart"/>
       <w:r>
         <w:rPr>
           <w:rFonts w:ascii="Times New Roman" w:hAnsi="Times New Roman" w:cs="Times New Roman"/>
           <w:lang w:val="es-ES"/>
         </w:rPr>
-        <w:t>hive-server</w:t>
+        <w:t>hive</w:t>
+      </w:r>
+      <w:proofErr w:type="spellEnd"/>
+      <w:r>
+        <w:rPr>
+          <w:rFonts w:ascii="Times New Roman" w:hAnsi="Times New Roman" w:cs="Times New Roman"/>
+          <w:lang w:val="es-ES"/>
+        </w:rPr>
+        <w:t>-server</w:t>
       </w:r>
     </w:p>
     <w:p>
@@ -3964,7 +4413,29 @@
                 <w:bCs/>
                 <w:lang w:val="es-ES"/>
               </w:rPr>
-              <w:t>Puertos (host:contenedor)</w:t>
+              <w:t>Puertos (</w:t>
+            </w:r>
+            <w:proofErr w:type="spellStart"/>
+            <w:proofErr w:type="gramStart"/>
+            <w:r>
+              <w:rPr>
+                <w:rFonts w:ascii="Times New Roman" w:hAnsi="Times New Roman" w:cs="Times New Roman"/>
+                <w:b/>
+                <w:bCs/>
+                <w:lang w:val="es-ES"/>
+              </w:rPr>
+              <w:t>host:contenedor</w:t>
+            </w:r>
+            <w:proofErr w:type="spellEnd"/>
+            <w:proofErr w:type="gramEnd"/>
+            <w:r>
+              <w:rPr>
+                <w:rFonts w:ascii="Times New Roman" w:hAnsi="Times New Roman" w:cs="Times New Roman"/>
+                <w:b/>
+                <w:bCs/>
+                <w:lang w:val="es-ES"/>
+              </w:rPr>
+              <w:t>)</w:t>
             </w:r>
           </w:p>
         </w:tc>
@@ -3983,6 +4454,7 @@
                 <w:lang w:val="es-ES"/>
               </w:rPr>
             </w:pPr>
+            <w:proofErr w:type="spellStart"/>
             <w:r>
               <w:rPr>
                 <w:rFonts w:ascii="Times New Roman" w:hAnsi="Times New Roman" w:cs="Times New Roman"/>
@@ -3992,6 +4464,7 @@
               </w:rPr>
               <w:t>yarn-resourcemanager</w:t>
             </w:r>
+            <w:proofErr w:type="spellEnd"/>
           </w:p>
         </w:tc>
         <w:tc>
@@ -4034,7 +4507,39 @@
                 <w:rFonts w:ascii="Times New Roman" w:hAnsi="Times New Roman" w:cs="Times New Roman"/>
                 <w:lang w:val="es-ES"/>
               </w:rPr>
-              <w:t>Construida desde el Dockerfile local (basada en una imagen base con Hadoop, Spark y Hive).</w:t>
+              <w:t xml:space="preserve">Construida desde el </w:t>
+            </w:r>
+            <w:proofErr w:type="spellStart"/>
+            <w:r>
+              <w:rPr>
+                <w:rFonts w:ascii="Times New Roman" w:hAnsi="Times New Roman" w:cs="Times New Roman"/>
+                <w:lang w:val="es-ES"/>
+              </w:rPr>
+              <w:t>Dockerfile</w:t>
+            </w:r>
+            <w:proofErr w:type="spellEnd"/>
+            <w:r>
+              <w:rPr>
+                <w:rFonts w:ascii="Times New Roman" w:hAnsi="Times New Roman" w:cs="Times New Roman"/>
+                <w:lang w:val="es-ES"/>
+              </w:rPr>
+              <w:t xml:space="preserve"> local (basada en una imagen base con Hadoop, Spark y </w:t>
+            </w:r>
+            <w:proofErr w:type="spellStart"/>
+            <w:r>
+              <w:rPr>
+                <w:rFonts w:ascii="Times New Roman" w:hAnsi="Times New Roman" w:cs="Times New Roman"/>
+                <w:lang w:val="es-ES"/>
+              </w:rPr>
+              <w:t>Hive</w:t>
+            </w:r>
+            <w:proofErr w:type="spellEnd"/>
+            <w:r>
+              <w:rPr>
+                <w:rFonts w:ascii="Times New Roman" w:hAnsi="Times New Roman" w:cs="Times New Roman"/>
+                <w:lang w:val="es-ES"/>
+              </w:rPr>
+              <w:t>).</w:t>
             </w:r>
           </w:p>
         </w:tc>
@@ -4056,7 +4561,23 @@
                 <w:rFonts w:ascii="Times New Roman" w:hAnsi="Times New Roman" w:cs="Times New Roman"/>
                 <w:lang w:val="en-US"/>
               </w:rPr>
-              <w:t>8088:8088 (YARN ResourceManager Web UI), 8032:8032, 8030:8030, 8031:8031, 9000:9000 (HDFS)</w:t>
+              <w:t xml:space="preserve">8088:8088 (YARN </w:t>
+            </w:r>
+            <w:proofErr w:type="spellStart"/>
+            <w:r>
+              <w:rPr>
+                <w:rFonts w:ascii="Times New Roman" w:hAnsi="Times New Roman" w:cs="Times New Roman"/>
+                <w:lang w:val="en-US"/>
+              </w:rPr>
+              <w:t>ResourceManager</w:t>
+            </w:r>
+            <w:proofErr w:type="spellEnd"/>
+            <w:r>
+              <w:rPr>
+                <w:rFonts w:ascii="Times New Roman" w:hAnsi="Times New Roman" w:cs="Times New Roman"/>
+                <w:lang w:val="en-US"/>
+              </w:rPr>
+              <w:t xml:space="preserve"> Web UI), 8032:8032, 8030:8030, 8031:8031, 9000:9000 (HDFS)</w:t>
             </w:r>
           </w:p>
         </w:tc>
@@ -4075,6 +4596,7 @@
                 <w:lang w:val="es-ES"/>
               </w:rPr>
             </w:pPr>
+            <w:proofErr w:type="spellStart"/>
             <w:r>
               <w:rPr>
                 <w:rFonts w:ascii="Times New Roman" w:hAnsi="Times New Roman" w:cs="Times New Roman"/>
@@ -4084,6 +4606,7 @@
               </w:rPr>
               <w:t>yarn-nodemanager</w:t>
             </w:r>
+            <w:proofErr w:type="spellEnd"/>
           </w:p>
         </w:tc>
         <w:tc>
@@ -4148,7 +4671,23 @@
                 <w:rFonts w:ascii="Times New Roman" w:hAnsi="Times New Roman" w:cs="Times New Roman"/>
                 <w:lang w:val="es-ES"/>
               </w:rPr>
-              <w:t>8042:8042 (NodeManager Web UI)</w:t>
+              <w:t>8042:8042 (</w:t>
+            </w:r>
+            <w:proofErr w:type="spellStart"/>
+            <w:r>
+              <w:rPr>
+                <w:rFonts w:ascii="Times New Roman" w:hAnsi="Times New Roman" w:cs="Times New Roman"/>
+                <w:lang w:val="es-ES"/>
+              </w:rPr>
+              <w:t>NodeManager</w:t>
+            </w:r>
+            <w:proofErr w:type="spellEnd"/>
+            <w:r>
+              <w:rPr>
+                <w:rFonts w:ascii="Times New Roman" w:hAnsi="Times New Roman" w:cs="Times New Roman"/>
+                <w:lang w:val="es-ES"/>
+              </w:rPr>
+              <w:t xml:space="preserve"> Web UI)</w:t>
             </w:r>
           </w:p>
         </w:tc>
@@ -4167,6 +4706,7 @@
                 <w:lang w:val="es-ES"/>
               </w:rPr>
             </w:pPr>
+            <w:proofErr w:type="spellStart"/>
             <w:r>
               <w:rPr>
                 <w:rFonts w:ascii="Times New Roman" w:hAnsi="Times New Roman" w:cs="Times New Roman"/>
@@ -4174,8 +4714,29 @@
                 <w:bCs/>
                 <w:lang w:val="es-ES"/>
               </w:rPr>
-              <w:t>spark-master</w:t>
-            </w:r>
+              <w:t>spark</w:t>
+            </w:r>
+            <w:proofErr w:type="spellEnd"/>
+            <w:r>
+              <w:rPr>
+                <w:rFonts w:ascii="Times New Roman" w:hAnsi="Times New Roman" w:cs="Times New Roman"/>
+                <w:b/>
+                <w:bCs/>
+                <w:lang w:val="es-ES"/>
+              </w:rPr>
+              <w:t>-</w:t>
+            </w:r>
+            <w:proofErr w:type="gramStart"/>
+            <w:r>
+              <w:rPr>
+                <w:rFonts w:ascii="Times New Roman" w:hAnsi="Times New Roman" w:cs="Times New Roman"/>
+                <w:b/>
+                <w:bCs/>
+                <w:lang w:val="es-ES"/>
+              </w:rPr>
+              <w:t>master</w:t>
+            </w:r>
+            <w:proofErr w:type="gramEnd"/>
           </w:p>
         </w:tc>
         <w:tc>
@@ -4240,7 +4801,23 @@
                 <w:rFonts w:ascii="Times New Roman" w:hAnsi="Times New Roman" w:cs="Times New Roman"/>
                 <w:lang w:val="es-ES"/>
               </w:rPr>
-              <w:t>8080:8080 (Spark Master UI), 7077:7077 (puerto de comunicación Spark)</w:t>
+              <w:t xml:space="preserve">8080:8080 (Spark </w:t>
+            </w:r>
+            <w:proofErr w:type="gramStart"/>
+            <w:r>
+              <w:rPr>
+                <w:rFonts w:ascii="Times New Roman" w:hAnsi="Times New Roman" w:cs="Times New Roman"/>
+                <w:lang w:val="es-ES"/>
+              </w:rPr>
+              <w:t>Master</w:t>
+            </w:r>
+            <w:proofErr w:type="gramEnd"/>
+            <w:r>
+              <w:rPr>
+                <w:rFonts w:ascii="Times New Roman" w:hAnsi="Times New Roman" w:cs="Times New Roman"/>
+                <w:lang w:val="es-ES"/>
+              </w:rPr>
+              <w:t xml:space="preserve"> UI), 7077:7077 (puerto de comunicación Spark)</w:t>
             </w:r>
           </w:p>
         </w:tc>
@@ -4259,6 +4836,7 @@
                 <w:lang w:val="es-ES"/>
               </w:rPr>
             </w:pPr>
+            <w:proofErr w:type="spellStart"/>
             <w:r>
               <w:rPr>
                 <w:rFonts w:ascii="Times New Roman" w:hAnsi="Times New Roman" w:cs="Times New Roman"/>
@@ -4268,6 +4846,7 @@
               </w:rPr>
               <w:t>spark-worker</w:t>
             </w:r>
+            <w:proofErr w:type="spellEnd"/>
           </w:p>
         </w:tc>
         <w:tc>
@@ -4351,6 +4930,7 @@
                 <w:lang w:val="es-ES"/>
               </w:rPr>
             </w:pPr>
+            <w:proofErr w:type="spellStart"/>
             <w:r>
               <w:rPr>
                 <w:rFonts w:ascii="Times New Roman" w:hAnsi="Times New Roman" w:cs="Times New Roman"/>
@@ -4361,6 +4941,7 @@
               <w:lastRenderedPageBreak/>
               <w:t>hive-metastore</w:t>
             </w:r>
+            <w:proofErr w:type="spellEnd"/>
           </w:p>
         </w:tc>
         <w:tc>
@@ -4381,7 +4962,23 @@
                 <w:rFonts w:ascii="Times New Roman" w:hAnsi="Times New Roman" w:cs="Times New Roman"/>
                 <w:lang w:val="es-ES"/>
               </w:rPr>
-              <w:t>Almacén de metadatos de Hive.</w:t>
+              <w:t xml:space="preserve">Almacén de metadatos de </w:t>
+            </w:r>
+            <w:proofErr w:type="spellStart"/>
+            <w:r>
+              <w:rPr>
+                <w:rFonts w:ascii="Times New Roman" w:hAnsi="Times New Roman" w:cs="Times New Roman"/>
+                <w:lang w:val="es-ES"/>
+              </w:rPr>
+              <w:t>Hive</w:t>
+            </w:r>
+            <w:proofErr w:type="spellEnd"/>
+            <w:r>
+              <w:rPr>
+                <w:rFonts w:ascii="Times New Roman" w:hAnsi="Times New Roman" w:cs="Times New Roman"/>
+                <w:lang w:val="es-ES"/>
+              </w:rPr>
+              <w:t>.</w:t>
             </w:r>
           </w:p>
         </w:tc>
@@ -4444,6 +5041,7 @@
                 <w:lang w:val="es-ES"/>
               </w:rPr>
             </w:pPr>
+            <w:proofErr w:type="spellStart"/>
             <w:r>
               <w:rPr>
                 <w:rFonts w:ascii="Times New Roman" w:hAnsi="Times New Roman" w:cs="Times New Roman"/>
@@ -4451,7 +5049,17 @@
                 <w:bCs/>
                 <w:lang w:val="es-ES"/>
               </w:rPr>
-              <w:t>hive-server</w:t>
+              <w:t>hive</w:t>
+            </w:r>
+            <w:proofErr w:type="spellEnd"/>
+            <w:r>
+              <w:rPr>
+                <w:rFonts w:ascii="Times New Roman" w:hAnsi="Times New Roman" w:cs="Times New Roman"/>
+                <w:b/>
+                <w:bCs/>
+                <w:lang w:val="es-ES"/>
+              </w:rPr>
+              <w:t>-server</w:t>
             </w:r>
           </w:p>
         </w:tc>
@@ -4517,7 +5125,23 @@
                 <w:rFonts w:ascii="Times New Roman" w:hAnsi="Times New Roman" w:cs="Times New Roman"/>
                 <w:lang w:val="es-ES"/>
               </w:rPr>
-              <w:t>10000:10000 (Hive Server), 10002:10002</w:t>
+              <w:t>10000:10000 (</w:t>
+            </w:r>
+            <w:proofErr w:type="spellStart"/>
+            <w:r>
+              <w:rPr>
+                <w:rFonts w:ascii="Times New Roman" w:hAnsi="Times New Roman" w:cs="Times New Roman"/>
+                <w:lang w:val="es-ES"/>
+              </w:rPr>
+              <w:t>Hive</w:t>
+            </w:r>
+            <w:proofErr w:type="spellEnd"/>
+            <w:r>
+              <w:rPr>
+                <w:rFonts w:ascii="Times New Roman" w:hAnsi="Times New Roman" w:cs="Times New Roman"/>
+                <w:lang w:val="es-ES"/>
+              </w:rPr>
+              <w:t xml:space="preserve"> Server), 10002:10002</w:t>
             </w:r>
           </w:p>
         </w:tc>
@@ -4576,7 +5200,23 @@
           <w:rFonts w:ascii="Times New Roman" w:hAnsi="Times New Roman" w:cs="Times New Roman"/>
           <w:lang w:val="es-ES"/>
         </w:rPr>
-        <w:t xml:space="preserve"> llamada spark-network.</w:t>
+        <w:t xml:space="preserve"> llamada </w:t>
+      </w:r>
+      <w:proofErr w:type="spellStart"/>
+      <w:r>
+        <w:rPr>
+          <w:rFonts w:ascii="Times New Roman" w:hAnsi="Times New Roman" w:cs="Times New Roman"/>
+          <w:lang w:val="es-ES"/>
+        </w:rPr>
+        <w:t>spark-network</w:t>
+      </w:r>
+      <w:proofErr w:type="spellEnd"/>
+      <w:r>
+        <w:rPr>
+          <w:rFonts w:ascii="Times New Roman" w:hAnsi="Times New Roman" w:cs="Times New Roman"/>
+          <w:lang w:val="es-ES"/>
+        </w:rPr>
+        <w:t>.</w:t>
       </w:r>
     </w:p>
     <w:p>
@@ -4596,7 +5236,23 @@
           <w:rFonts w:ascii="Times New Roman" w:hAnsi="Times New Roman" w:cs="Times New Roman"/>
           <w:lang w:val="es-ES"/>
         </w:rPr>
-        <w:t>Todos los servicios se conectan a esta red, lo que permite la comunicación entre contenedores mediante nombres de host (ej. spark-master:7077).</w:t>
+        <w:t>Todos los servicios se conectan a esta red, lo que permite la comunicación entre contenedores mediante nombres de host (ej. spark-</w:t>
+      </w:r>
+      <w:proofErr w:type="gramStart"/>
+      <w:r>
+        <w:rPr>
+          <w:rFonts w:ascii="Times New Roman" w:hAnsi="Times New Roman" w:cs="Times New Roman"/>
+          <w:lang w:val="es-ES"/>
+        </w:rPr>
+        <w:t>master</w:t>
+      </w:r>
+      <w:proofErr w:type="gramEnd"/>
+      <w:r>
+        <w:rPr>
+          <w:rFonts w:ascii="Times New Roman" w:hAnsi="Times New Roman" w:cs="Times New Roman"/>
+          <w:lang w:val="es-ES"/>
+        </w:rPr>
+        <w:t>:7077).</w:t>
       </w:r>
     </w:p>
     <w:p>
@@ -4740,13 +5396,40 @@
                 <w:lang w:val="es-ES"/>
               </w:rPr>
             </w:pPr>
-            <w:r>
-              <w:rPr>
-                <w:rFonts w:ascii="Times New Roman" w:hAnsi="Times New Roman" w:cs="Times New Roman"/>
-                <w:lang w:val="es-ES"/>
-              </w:rPr>
-              <w:t>./config/hadoop</w:t>
-            </w:r>
+            <w:proofErr w:type="gramStart"/>
+            <w:r>
+              <w:rPr>
+                <w:rFonts w:ascii="Times New Roman" w:hAnsi="Times New Roman" w:cs="Times New Roman"/>
+                <w:lang w:val="es-ES"/>
+              </w:rPr>
+              <w:t>./</w:t>
+            </w:r>
+            <w:proofErr w:type="spellStart"/>
+            <w:proofErr w:type="gramEnd"/>
+            <w:r>
+              <w:rPr>
+                <w:rFonts w:ascii="Times New Roman" w:hAnsi="Times New Roman" w:cs="Times New Roman"/>
+                <w:lang w:val="es-ES"/>
+              </w:rPr>
+              <w:t>config</w:t>
+            </w:r>
+            <w:proofErr w:type="spellEnd"/>
+            <w:r>
+              <w:rPr>
+                <w:rFonts w:ascii="Times New Roman" w:hAnsi="Times New Roman" w:cs="Times New Roman"/>
+                <w:lang w:val="es-ES"/>
+              </w:rPr>
+              <w:t>/</w:t>
+            </w:r>
+            <w:proofErr w:type="spellStart"/>
+            <w:r>
+              <w:rPr>
+                <w:rFonts w:ascii="Times New Roman" w:hAnsi="Times New Roman" w:cs="Times New Roman"/>
+                <w:lang w:val="es-ES"/>
+              </w:rPr>
+              <w:t>hadoop</w:t>
+            </w:r>
+            <w:proofErr w:type="spellEnd"/>
           </w:p>
         </w:tc>
         <w:tc>
@@ -4767,7 +5450,39 @@
                 <w:rFonts w:ascii="Times New Roman" w:hAnsi="Times New Roman" w:cs="Times New Roman"/>
                 <w:lang w:val="en-US"/>
               </w:rPr>
-              <w:t>yarn-resourcemanager, yarn-nodemanager, spark-master</w:t>
+              <w:t>yarn-</w:t>
+            </w:r>
+            <w:proofErr w:type="spellStart"/>
+            <w:r>
+              <w:rPr>
+                <w:rFonts w:ascii="Times New Roman" w:hAnsi="Times New Roman" w:cs="Times New Roman"/>
+                <w:lang w:val="en-US"/>
+              </w:rPr>
+              <w:t>resourcemanager</w:t>
+            </w:r>
+            <w:proofErr w:type="spellEnd"/>
+            <w:r>
+              <w:rPr>
+                <w:rFonts w:ascii="Times New Roman" w:hAnsi="Times New Roman" w:cs="Times New Roman"/>
+                <w:lang w:val="en-US"/>
+              </w:rPr>
+              <w:t>, yarn-</w:t>
+            </w:r>
+            <w:proofErr w:type="spellStart"/>
+            <w:r>
+              <w:rPr>
+                <w:rFonts w:ascii="Times New Roman" w:hAnsi="Times New Roman" w:cs="Times New Roman"/>
+                <w:lang w:val="en-US"/>
+              </w:rPr>
+              <w:t>nodemanager</w:t>
+            </w:r>
+            <w:proofErr w:type="spellEnd"/>
+            <w:r>
+              <w:rPr>
+                <w:rFonts w:ascii="Times New Roman" w:hAnsi="Times New Roman" w:cs="Times New Roman"/>
+                <w:lang w:val="en-US"/>
+              </w:rPr>
+              <w:t>, spark-master</w:t>
             </w:r>
           </w:p>
         </w:tc>
@@ -4808,13 +5523,31 @@
                 <w:lang w:val="es-ES"/>
               </w:rPr>
             </w:pPr>
-            <w:r>
-              <w:rPr>
-                <w:rFonts w:ascii="Times New Roman" w:hAnsi="Times New Roman" w:cs="Times New Roman"/>
-                <w:lang w:val="es-ES"/>
-              </w:rPr>
-              <w:t>./logs/yarn</w:t>
-            </w:r>
+            <w:proofErr w:type="gramStart"/>
+            <w:r>
+              <w:rPr>
+                <w:rFonts w:ascii="Times New Roman" w:hAnsi="Times New Roman" w:cs="Times New Roman"/>
+                <w:lang w:val="es-ES"/>
+              </w:rPr>
+              <w:t>./</w:t>
+            </w:r>
+            <w:proofErr w:type="gramEnd"/>
+            <w:r>
+              <w:rPr>
+                <w:rFonts w:ascii="Times New Roman" w:hAnsi="Times New Roman" w:cs="Times New Roman"/>
+                <w:lang w:val="es-ES"/>
+              </w:rPr>
+              <w:t>logs/</w:t>
+            </w:r>
+            <w:proofErr w:type="spellStart"/>
+            <w:r>
+              <w:rPr>
+                <w:rFonts w:ascii="Times New Roman" w:hAnsi="Times New Roman" w:cs="Times New Roman"/>
+                <w:lang w:val="es-ES"/>
+              </w:rPr>
+              <w:t>yarn</w:t>
+            </w:r>
+            <w:proofErr w:type="spellEnd"/>
           </w:p>
         </w:tc>
         <w:tc>
@@ -4830,13 +5563,31 @@
                 <w:lang w:val="es-ES"/>
               </w:rPr>
             </w:pPr>
-            <w:r>
-              <w:rPr>
-                <w:rFonts w:ascii="Times New Roman" w:hAnsi="Times New Roman" w:cs="Times New Roman"/>
-                <w:lang w:val="es-ES"/>
-              </w:rPr>
-              <w:t>yarn-resourcemanager, yarn-nodemanager</w:t>
-            </w:r>
+            <w:proofErr w:type="spellStart"/>
+            <w:r>
+              <w:rPr>
+                <w:rFonts w:ascii="Times New Roman" w:hAnsi="Times New Roman" w:cs="Times New Roman"/>
+                <w:lang w:val="es-ES"/>
+              </w:rPr>
+              <w:t>yarn-resourcemanager</w:t>
+            </w:r>
+            <w:proofErr w:type="spellEnd"/>
+            <w:r>
+              <w:rPr>
+                <w:rFonts w:ascii="Times New Roman" w:hAnsi="Times New Roman" w:cs="Times New Roman"/>
+                <w:lang w:val="es-ES"/>
+              </w:rPr>
+              <w:t xml:space="preserve">, </w:t>
+            </w:r>
+            <w:proofErr w:type="spellStart"/>
+            <w:r>
+              <w:rPr>
+                <w:rFonts w:ascii="Times New Roman" w:hAnsi="Times New Roman" w:cs="Times New Roman"/>
+                <w:lang w:val="es-ES"/>
+              </w:rPr>
+              <w:t>yarn-nodemanager</w:t>
+            </w:r>
+            <w:proofErr w:type="spellEnd"/>
           </w:p>
         </w:tc>
         <w:tc>
@@ -4876,13 +5627,31 @@
                 <w:lang w:val="es-ES"/>
               </w:rPr>
             </w:pPr>
-            <w:r>
-              <w:rPr>
-                <w:rFonts w:ascii="Times New Roman" w:hAnsi="Times New Roman" w:cs="Times New Roman"/>
-                <w:lang w:val="es-ES"/>
-              </w:rPr>
-              <w:t>./logs/spark</w:t>
-            </w:r>
+            <w:proofErr w:type="gramStart"/>
+            <w:r>
+              <w:rPr>
+                <w:rFonts w:ascii="Times New Roman" w:hAnsi="Times New Roman" w:cs="Times New Roman"/>
+                <w:lang w:val="es-ES"/>
+              </w:rPr>
+              <w:t>./</w:t>
+            </w:r>
+            <w:proofErr w:type="gramEnd"/>
+            <w:r>
+              <w:rPr>
+                <w:rFonts w:ascii="Times New Roman" w:hAnsi="Times New Roman" w:cs="Times New Roman"/>
+                <w:lang w:val="es-ES"/>
+              </w:rPr>
+              <w:t>logs/</w:t>
+            </w:r>
+            <w:proofErr w:type="spellStart"/>
+            <w:r>
+              <w:rPr>
+                <w:rFonts w:ascii="Times New Roman" w:hAnsi="Times New Roman" w:cs="Times New Roman"/>
+                <w:lang w:val="es-ES"/>
+              </w:rPr>
+              <w:t>spark</w:t>
+            </w:r>
+            <w:proofErr w:type="spellEnd"/>
           </w:p>
         </w:tc>
         <w:tc>
@@ -4898,13 +5667,47 @@
                 <w:lang w:val="es-ES"/>
               </w:rPr>
             </w:pPr>
-            <w:r>
-              <w:rPr>
-                <w:rFonts w:ascii="Times New Roman" w:hAnsi="Times New Roman" w:cs="Times New Roman"/>
-                <w:lang w:val="es-ES"/>
-              </w:rPr>
-              <w:t>spark-master, spark-worker</w:t>
-            </w:r>
+            <w:proofErr w:type="spellStart"/>
+            <w:r>
+              <w:rPr>
+                <w:rFonts w:ascii="Times New Roman" w:hAnsi="Times New Roman" w:cs="Times New Roman"/>
+                <w:lang w:val="es-ES"/>
+              </w:rPr>
+              <w:t>spark</w:t>
+            </w:r>
+            <w:proofErr w:type="spellEnd"/>
+            <w:r>
+              <w:rPr>
+                <w:rFonts w:ascii="Times New Roman" w:hAnsi="Times New Roman" w:cs="Times New Roman"/>
+                <w:lang w:val="es-ES"/>
+              </w:rPr>
+              <w:t>-</w:t>
+            </w:r>
+            <w:proofErr w:type="gramStart"/>
+            <w:r>
+              <w:rPr>
+                <w:rFonts w:ascii="Times New Roman" w:hAnsi="Times New Roman" w:cs="Times New Roman"/>
+                <w:lang w:val="es-ES"/>
+              </w:rPr>
+              <w:t>master</w:t>
+            </w:r>
+            <w:proofErr w:type="gramEnd"/>
+            <w:r>
+              <w:rPr>
+                <w:rFonts w:ascii="Times New Roman" w:hAnsi="Times New Roman" w:cs="Times New Roman"/>
+                <w:lang w:val="es-ES"/>
+              </w:rPr>
+              <w:t xml:space="preserve">, </w:t>
+            </w:r>
+            <w:proofErr w:type="spellStart"/>
+            <w:r>
+              <w:rPr>
+                <w:rFonts w:ascii="Times New Roman" w:hAnsi="Times New Roman" w:cs="Times New Roman"/>
+                <w:lang w:val="es-ES"/>
+              </w:rPr>
+              <w:t>spark-worker</w:t>
+            </w:r>
+            <w:proofErr w:type="spellEnd"/>
           </w:p>
         </w:tc>
         <w:tc>
@@ -4944,13 +5747,31 @@
                 <w:lang w:val="es-ES"/>
               </w:rPr>
             </w:pPr>
-            <w:r>
-              <w:rPr>
-                <w:rFonts w:ascii="Times New Roman" w:hAnsi="Times New Roman" w:cs="Times New Roman"/>
-                <w:lang w:val="es-ES"/>
-              </w:rPr>
-              <w:t>./logs/hive</w:t>
-            </w:r>
+            <w:proofErr w:type="gramStart"/>
+            <w:r>
+              <w:rPr>
+                <w:rFonts w:ascii="Times New Roman" w:hAnsi="Times New Roman" w:cs="Times New Roman"/>
+                <w:lang w:val="es-ES"/>
+              </w:rPr>
+              <w:t>./</w:t>
+            </w:r>
+            <w:proofErr w:type="gramEnd"/>
+            <w:r>
+              <w:rPr>
+                <w:rFonts w:ascii="Times New Roman" w:hAnsi="Times New Roman" w:cs="Times New Roman"/>
+                <w:lang w:val="es-ES"/>
+              </w:rPr>
+              <w:t>logs/</w:t>
+            </w:r>
+            <w:proofErr w:type="spellStart"/>
+            <w:r>
+              <w:rPr>
+                <w:rFonts w:ascii="Times New Roman" w:hAnsi="Times New Roman" w:cs="Times New Roman"/>
+                <w:lang w:val="es-ES"/>
+              </w:rPr>
+              <w:t>hive</w:t>
+            </w:r>
+            <w:proofErr w:type="spellEnd"/>
           </w:p>
         </w:tc>
         <w:tc>
@@ -4966,12 +5787,37 @@
                 <w:lang w:val="es-ES"/>
               </w:rPr>
             </w:pPr>
-            <w:r>
-              <w:rPr>
-                <w:rFonts w:ascii="Times New Roman" w:hAnsi="Times New Roman" w:cs="Times New Roman"/>
-                <w:lang w:val="es-ES"/>
-              </w:rPr>
-              <w:t>hive-metastore, hive-server</w:t>
+            <w:proofErr w:type="spellStart"/>
+            <w:r>
+              <w:rPr>
+                <w:rFonts w:ascii="Times New Roman" w:hAnsi="Times New Roman" w:cs="Times New Roman"/>
+                <w:lang w:val="es-ES"/>
+              </w:rPr>
+              <w:t>hive-metastore</w:t>
+            </w:r>
+            <w:proofErr w:type="spellEnd"/>
+            <w:r>
+              <w:rPr>
+                <w:rFonts w:ascii="Times New Roman" w:hAnsi="Times New Roman" w:cs="Times New Roman"/>
+                <w:lang w:val="es-ES"/>
+              </w:rPr>
+              <w:t xml:space="preserve">, </w:t>
+            </w:r>
+            <w:proofErr w:type="spellStart"/>
+            <w:r>
+              <w:rPr>
+                <w:rFonts w:ascii="Times New Roman" w:hAnsi="Times New Roman" w:cs="Times New Roman"/>
+                <w:lang w:val="es-ES"/>
+              </w:rPr>
+              <w:t>hive</w:t>
+            </w:r>
+            <w:proofErr w:type="spellEnd"/>
+            <w:r>
+              <w:rPr>
+                <w:rFonts w:ascii="Times New Roman" w:hAnsi="Times New Roman" w:cs="Times New Roman"/>
+                <w:lang w:val="es-ES"/>
+              </w:rPr>
+              <w:t>-server</w:t>
             </w:r>
           </w:p>
         </w:tc>
@@ -4993,8 +5839,17 @@
                 <w:rFonts w:ascii="Times New Roman" w:hAnsi="Times New Roman" w:cs="Times New Roman"/>
                 <w:lang w:val="es-ES"/>
               </w:rPr>
-              <w:t>Logs de Hive</w:t>
-            </w:r>
+              <w:t xml:space="preserve">Logs de </w:t>
+            </w:r>
+            <w:proofErr w:type="spellStart"/>
+            <w:r>
+              <w:rPr>
+                <w:rFonts w:ascii="Times New Roman" w:hAnsi="Times New Roman" w:cs="Times New Roman"/>
+                <w:lang w:val="es-ES"/>
+              </w:rPr>
+              <w:t>Hive</w:t>
+            </w:r>
+            <w:proofErr w:type="spellEnd"/>
           </w:p>
         </w:tc>
       </w:tr>
@@ -5012,12 +5867,21 @@
                 <w:lang w:val="es-ES"/>
               </w:rPr>
             </w:pPr>
-            <w:r>
-              <w:rPr>
-                <w:rFonts w:ascii="Times New Roman" w:hAnsi="Times New Roman" w:cs="Times New Roman"/>
-                <w:lang w:val="es-ES"/>
-              </w:rPr>
-              <w:t>./scripts</w:t>
+            <w:proofErr w:type="gramStart"/>
+            <w:r>
+              <w:rPr>
+                <w:rFonts w:ascii="Times New Roman" w:hAnsi="Times New Roman" w:cs="Times New Roman"/>
+                <w:lang w:val="es-ES"/>
+              </w:rPr>
+              <w:t>./</w:t>
+            </w:r>
+            <w:proofErr w:type="gramEnd"/>
+            <w:r>
+              <w:rPr>
+                <w:rFonts w:ascii="Times New Roman" w:hAnsi="Times New Roman" w:cs="Times New Roman"/>
+                <w:lang w:val="es-ES"/>
+              </w:rPr>
+              <w:t>scripts</w:t>
             </w:r>
           </w:p>
         </w:tc>
@@ -5034,6 +5898,7 @@
                 <w:lang w:val="es-ES"/>
               </w:rPr>
             </w:pPr>
+            <w:proofErr w:type="spellStart"/>
             <w:r>
               <w:rPr>
                 <w:rFonts w:ascii="Times New Roman" w:hAnsi="Times New Roman" w:cs="Times New Roman"/>
@@ -5041,6 +5906,7 @@
               </w:rPr>
               <w:t>yarn-resourcemanager</w:t>
             </w:r>
+            <w:proofErr w:type="spellEnd"/>
           </w:p>
         </w:tc>
         <w:tc>
@@ -5080,12 +5946,21 @@
                 <w:lang w:val="es-ES"/>
               </w:rPr>
             </w:pPr>
-            <w:r>
-              <w:rPr>
-                <w:rFonts w:ascii="Times New Roman" w:hAnsi="Times New Roman" w:cs="Times New Roman"/>
-                <w:lang w:val="es-ES"/>
-              </w:rPr>
-              <w:t>./data</w:t>
+            <w:proofErr w:type="gramStart"/>
+            <w:r>
+              <w:rPr>
+                <w:rFonts w:ascii="Times New Roman" w:hAnsi="Times New Roman" w:cs="Times New Roman"/>
+                <w:lang w:val="es-ES"/>
+              </w:rPr>
+              <w:t>./</w:t>
+            </w:r>
+            <w:proofErr w:type="gramEnd"/>
+            <w:r>
+              <w:rPr>
+                <w:rFonts w:ascii="Times New Roman" w:hAnsi="Times New Roman" w:cs="Times New Roman"/>
+                <w:lang w:val="es-ES"/>
+              </w:rPr>
+              <w:t>data</w:t>
             </w:r>
           </w:p>
         </w:tc>
@@ -5107,7 +5982,23 @@
                 <w:rFonts w:ascii="Times New Roman" w:hAnsi="Times New Roman" w:cs="Times New Roman"/>
                 <w:lang w:val="en-US"/>
               </w:rPr>
-              <w:t>spark-master, spark-worker, hive-metastore, hive-server</w:t>
+              <w:t>spark-master, spark-worker, hive-</w:t>
+            </w:r>
+            <w:proofErr w:type="spellStart"/>
+            <w:r>
+              <w:rPr>
+                <w:rFonts w:ascii="Times New Roman" w:hAnsi="Times New Roman" w:cs="Times New Roman"/>
+                <w:lang w:val="en-US"/>
+              </w:rPr>
+              <w:t>metastore</w:t>
+            </w:r>
+            <w:proofErr w:type="spellEnd"/>
+            <w:r>
+              <w:rPr>
+                <w:rFonts w:ascii="Times New Roman" w:hAnsi="Times New Roman" w:cs="Times New Roman"/>
+                <w:lang w:val="en-US"/>
+              </w:rPr>
+              <w:t>, hive-server</w:t>
             </w:r>
           </w:p>
         </w:tc>
@@ -5167,12 +6058,37 @@
           <w:lang w:val="es-ES"/>
         </w:rPr>
       </w:pPr>
+      <w:proofErr w:type="spellStart"/>
       <w:r>
         <w:rPr>
           <w:rFonts w:ascii="Times New Roman" w:hAnsi="Times New Roman" w:cs="Times New Roman"/>
           <w:lang w:val="es-ES"/>
         </w:rPr>
-        <w:t>yarn-nodemanager depende de yarn-resourcemanager.</w:t>
+        <w:t>yarn-nodemanager</w:t>
+      </w:r>
+      <w:proofErr w:type="spellEnd"/>
+      <w:r>
+        <w:rPr>
+          <w:rFonts w:ascii="Times New Roman" w:hAnsi="Times New Roman" w:cs="Times New Roman"/>
+          <w:lang w:val="es-ES"/>
+        </w:rPr>
+        <w:t xml:space="preserve"> depende de </w:t>
+      </w:r>
+      <w:proofErr w:type="spellStart"/>
+      <w:r>
+        <w:rPr>
+          <w:rFonts w:ascii="Times New Roman" w:hAnsi="Times New Roman" w:cs="Times New Roman"/>
+          <w:lang w:val="es-ES"/>
+        </w:rPr>
+        <w:t>yarn-resourcemanager</w:t>
+      </w:r>
+      <w:proofErr w:type="spellEnd"/>
+      <w:r>
+        <w:rPr>
+          <w:rFonts w:ascii="Times New Roman" w:hAnsi="Times New Roman" w:cs="Times New Roman"/>
+          <w:lang w:val="es-ES"/>
+        </w:rPr>
+        <w:t>.</w:t>
       </w:r>
     </w:p>
     <w:p>
@@ -5192,7 +6108,23 @@
           <w:rFonts w:ascii="Times New Roman" w:hAnsi="Times New Roman" w:cs="Times New Roman"/>
           <w:lang w:val="en-US"/>
         </w:rPr>
-        <w:t>spark-worker depende de spark-master.</w:t>
+        <w:t xml:space="preserve">spark-worker </w:t>
+      </w:r>
+      <w:proofErr w:type="spellStart"/>
+      <w:r>
+        <w:rPr>
+          <w:rFonts w:ascii="Times New Roman" w:hAnsi="Times New Roman" w:cs="Times New Roman"/>
+          <w:lang w:val="en-US"/>
+        </w:rPr>
+        <w:t>depende</w:t>
+      </w:r>
+      <w:proofErr w:type="spellEnd"/>
+      <w:r>
+        <w:rPr>
+          <w:rFonts w:ascii="Times New Roman" w:hAnsi="Times New Roman" w:cs="Times New Roman"/>
+          <w:lang w:val="en-US"/>
+        </w:rPr>
+        <w:t xml:space="preserve"> de spark-master.</w:t>
       </w:r>
     </w:p>
     <w:p>
@@ -5207,12 +6139,37 @@
           <w:lang w:val="es-ES"/>
         </w:rPr>
       </w:pPr>
+      <w:proofErr w:type="spellStart"/>
       <w:r>
         <w:rPr>
           <w:rFonts w:ascii="Times New Roman" w:hAnsi="Times New Roman" w:cs="Times New Roman"/>
           <w:lang w:val="es-ES"/>
         </w:rPr>
-        <w:t>hive-server depende de hive-metastore.</w:t>
+        <w:t>hive</w:t>
+      </w:r>
+      <w:proofErr w:type="spellEnd"/>
+      <w:r>
+        <w:rPr>
+          <w:rFonts w:ascii="Times New Roman" w:hAnsi="Times New Roman" w:cs="Times New Roman"/>
+          <w:lang w:val="es-ES"/>
+        </w:rPr>
+        <w:t xml:space="preserve">-server depende de </w:t>
+      </w:r>
+      <w:proofErr w:type="spellStart"/>
+      <w:r>
+        <w:rPr>
+          <w:rFonts w:ascii="Times New Roman" w:hAnsi="Times New Roman" w:cs="Times New Roman"/>
+          <w:lang w:val="es-ES"/>
+        </w:rPr>
+        <w:t>hive-metastore</w:t>
+      </w:r>
+      <w:proofErr w:type="spellEnd"/>
+      <w:r>
+        <w:rPr>
+          <w:rFonts w:ascii="Times New Roman" w:hAnsi="Times New Roman" w:cs="Times New Roman"/>
+          <w:lang w:val="es-ES"/>
+        </w:rPr>
+        <w:t>.</w:t>
       </w:r>
     </w:p>
     <w:p>
@@ -5227,13 +6184,54 @@
           <w:lang w:val="es-ES"/>
         </w:rPr>
       </w:pPr>
+      <w:proofErr w:type="spellStart"/>
       <w:r>
         <w:rPr>
           <w:rFonts w:ascii="Times New Roman" w:hAnsi="Times New Roman" w:cs="Times New Roman"/>
           <w:lang w:val="es-ES"/>
         </w:rPr>
         <w:lastRenderedPageBreak/>
-        <w:t>hive-metastore tiene una condición de precondición hacia spark-master (según la variable SERVICE_PRECONDITION).</w:t>
+        <w:t>hive-metastore</w:t>
+      </w:r>
+      <w:proofErr w:type="spellEnd"/>
+      <w:r>
+        <w:rPr>
+          <w:rFonts w:ascii="Times New Roman" w:hAnsi="Times New Roman" w:cs="Times New Roman"/>
+          <w:lang w:val="es-ES"/>
+        </w:rPr>
+        <w:t xml:space="preserve"> tiene una condición de precondición hacia </w:t>
+      </w:r>
+      <w:proofErr w:type="spellStart"/>
+      <w:r>
+        <w:rPr>
+          <w:rFonts w:ascii="Times New Roman" w:hAnsi="Times New Roman" w:cs="Times New Roman"/>
+          <w:lang w:val="es-ES"/>
+        </w:rPr>
+        <w:t>spark</w:t>
+      </w:r>
+      <w:proofErr w:type="spellEnd"/>
+      <w:r>
+        <w:rPr>
+          <w:rFonts w:ascii="Times New Roman" w:hAnsi="Times New Roman" w:cs="Times New Roman"/>
+          <w:lang w:val="es-ES"/>
+        </w:rPr>
+        <w:t>-</w:t>
+      </w:r>
+      <w:proofErr w:type="gramStart"/>
+      <w:r>
+        <w:rPr>
+          <w:rFonts w:ascii="Times New Roman" w:hAnsi="Times New Roman" w:cs="Times New Roman"/>
+          <w:lang w:val="es-ES"/>
+        </w:rPr>
+        <w:t>master</w:t>
+      </w:r>
+      <w:proofErr w:type="gramEnd"/>
+      <w:r>
+        <w:rPr>
+          <w:rFonts w:ascii="Times New Roman" w:hAnsi="Times New Roman" w:cs="Times New Roman"/>
+          <w:lang w:val="es-ES"/>
+        </w:rPr>
+        <w:t xml:space="preserve"> (según la variable SERVICE_PRECONDITION).</w:t>
       </w:r>
     </w:p>
     <w:p>
@@ -5334,6 +6332,7 @@
                 <w:lang w:val="es-ES"/>
               </w:rPr>
             </w:pPr>
+            <w:proofErr w:type="spellStart"/>
             <w:r>
               <w:rPr>
                 <w:rFonts w:ascii="Times New Roman" w:hAnsi="Times New Roman" w:cs="Times New Roman"/>
@@ -5343,6 +6342,7 @@
               </w:rPr>
               <w:t>yarn-resourcemanager</w:t>
             </w:r>
+            <w:proofErr w:type="spellEnd"/>
           </w:p>
         </w:tc>
         <w:tc>
@@ -5363,7 +6363,23 @@
                 <w:rFonts w:ascii="Times New Roman" w:hAnsi="Times New Roman" w:cs="Times New Roman"/>
                 <w:lang w:val="en-US"/>
               </w:rPr>
-              <w:t>HADOOP_HOME=/opt/hadoop, YARN_RESOURCEMANAGER_USER=root, SPARK_HOME=/opt/spark</w:t>
+              <w:t>HADOOP_HOME=/opt/</w:t>
+            </w:r>
+            <w:proofErr w:type="spellStart"/>
+            <w:r>
+              <w:rPr>
+                <w:rFonts w:ascii="Times New Roman" w:hAnsi="Times New Roman" w:cs="Times New Roman"/>
+                <w:lang w:val="en-US"/>
+              </w:rPr>
+              <w:t>hadoop</w:t>
+            </w:r>
+            <w:proofErr w:type="spellEnd"/>
+            <w:r>
+              <w:rPr>
+                <w:rFonts w:ascii="Times New Roman" w:hAnsi="Times New Roman" w:cs="Times New Roman"/>
+                <w:lang w:val="en-US"/>
+              </w:rPr>
+              <w:t>, YARN_RESOURCEMANAGER_USER=root, SPARK_HOME=/opt/spark</w:t>
             </w:r>
           </w:p>
         </w:tc>
@@ -5382,6 +6398,7 @@
                 <w:lang w:val="es-ES"/>
               </w:rPr>
             </w:pPr>
+            <w:proofErr w:type="spellStart"/>
             <w:r>
               <w:rPr>
                 <w:rFonts w:ascii="Times New Roman" w:hAnsi="Times New Roman" w:cs="Times New Roman"/>
@@ -5391,6 +6408,7 @@
               </w:rPr>
               <w:t>yarn-nodemanager</w:t>
             </w:r>
+            <w:proofErr w:type="spellEnd"/>
           </w:p>
         </w:tc>
         <w:tc>
@@ -5411,7 +6429,23 @@
                 <w:rFonts w:ascii="Times New Roman" w:hAnsi="Times New Roman" w:cs="Times New Roman"/>
                 <w:lang w:val="en-US"/>
               </w:rPr>
-              <w:t>HADOOP_HOME=/opt/hadoop, YARN_NODEMANAGER_USER=root</w:t>
+              <w:t>HADOOP_HOME=/opt/</w:t>
+            </w:r>
+            <w:proofErr w:type="spellStart"/>
+            <w:r>
+              <w:rPr>
+                <w:rFonts w:ascii="Times New Roman" w:hAnsi="Times New Roman" w:cs="Times New Roman"/>
+                <w:lang w:val="en-US"/>
+              </w:rPr>
+              <w:t>hadoop</w:t>
+            </w:r>
+            <w:proofErr w:type="spellEnd"/>
+            <w:r>
+              <w:rPr>
+                <w:rFonts w:ascii="Times New Roman" w:hAnsi="Times New Roman" w:cs="Times New Roman"/>
+                <w:lang w:val="en-US"/>
+              </w:rPr>
+              <w:t>, YARN_NODEMANAGER_USER=root</w:t>
             </w:r>
           </w:p>
         </w:tc>
@@ -5430,6 +6464,7 @@
                 <w:lang w:val="es-ES"/>
               </w:rPr>
             </w:pPr>
+            <w:proofErr w:type="spellStart"/>
             <w:r>
               <w:rPr>
                 <w:rFonts w:ascii="Times New Roman" w:hAnsi="Times New Roman" w:cs="Times New Roman"/>
@@ -5437,8 +6472,29 @@
                 <w:bCs/>
                 <w:lang w:val="es-ES"/>
               </w:rPr>
-              <w:t>spark-master</w:t>
-            </w:r>
+              <w:t>spark</w:t>
+            </w:r>
+            <w:proofErr w:type="spellEnd"/>
+            <w:r>
+              <w:rPr>
+                <w:rFonts w:ascii="Times New Roman" w:hAnsi="Times New Roman" w:cs="Times New Roman"/>
+                <w:b/>
+                <w:bCs/>
+                <w:lang w:val="es-ES"/>
+              </w:rPr>
+              <w:t>-</w:t>
+            </w:r>
+            <w:proofErr w:type="gramStart"/>
+            <w:r>
+              <w:rPr>
+                <w:rFonts w:ascii="Times New Roman" w:hAnsi="Times New Roman" w:cs="Times New Roman"/>
+                <w:b/>
+                <w:bCs/>
+                <w:lang w:val="es-ES"/>
+              </w:rPr>
+              <w:t>master</w:t>
+            </w:r>
+            <w:proofErr w:type="gramEnd"/>
           </w:p>
         </w:tc>
         <w:tc>
@@ -5459,8 +6515,49 @@
                 <w:rFonts w:ascii="Times New Roman" w:hAnsi="Times New Roman" w:cs="Times New Roman"/>
                 <w:lang w:val="en-US"/>
               </w:rPr>
-              <w:t>SPARK_MODE=master, SPARK_RPC_AUTHENTICATION_ENABLED=no, HADOOP_CONF_DIR=/opt/hadoop/etc/hadoop</w:t>
-            </w:r>
+              <w:t>SPARK_MODE=master, SPARK_RPC_AUTHENTICATION_ENABLED=no, HADOOP_CONF_DIR=/opt/</w:t>
+            </w:r>
+            <w:proofErr w:type="spellStart"/>
+            <w:r>
+              <w:rPr>
+                <w:rFonts w:ascii="Times New Roman" w:hAnsi="Times New Roman" w:cs="Times New Roman"/>
+                <w:lang w:val="en-US"/>
+              </w:rPr>
+              <w:t>hadoop</w:t>
+            </w:r>
+            <w:proofErr w:type="spellEnd"/>
+            <w:r>
+              <w:rPr>
+                <w:rFonts w:ascii="Times New Roman" w:hAnsi="Times New Roman" w:cs="Times New Roman"/>
+                <w:lang w:val="en-US"/>
+              </w:rPr>
+              <w:t>/</w:t>
+            </w:r>
+            <w:proofErr w:type="spellStart"/>
+            <w:r>
+              <w:rPr>
+                <w:rFonts w:ascii="Times New Roman" w:hAnsi="Times New Roman" w:cs="Times New Roman"/>
+                <w:lang w:val="en-US"/>
+              </w:rPr>
+              <w:t>etc</w:t>
+            </w:r>
+            <w:proofErr w:type="spellEnd"/>
+            <w:r>
+              <w:rPr>
+                <w:rFonts w:ascii="Times New Roman" w:hAnsi="Times New Roman" w:cs="Times New Roman"/>
+                <w:lang w:val="en-US"/>
+              </w:rPr>
+              <w:t>/</w:t>
+            </w:r>
+            <w:proofErr w:type="spellStart"/>
+            <w:r>
+              <w:rPr>
+                <w:rFonts w:ascii="Times New Roman" w:hAnsi="Times New Roman" w:cs="Times New Roman"/>
+                <w:lang w:val="en-US"/>
+              </w:rPr>
+              <w:t>hadoop</w:t>
+            </w:r>
+            <w:proofErr w:type="spellEnd"/>
           </w:p>
         </w:tc>
       </w:tr>
@@ -5478,6 +6575,7 @@
                 <w:lang w:val="es-ES"/>
               </w:rPr>
             </w:pPr>
+            <w:proofErr w:type="spellStart"/>
             <w:r>
               <w:rPr>
                 <w:rFonts w:ascii="Times New Roman" w:hAnsi="Times New Roman" w:cs="Times New Roman"/>
@@ -5487,6 +6585,7 @@
               </w:rPr>
               <w:t>spark-worker</w:t>
             </w:r>
+            <w:proofErr w:type="spellEnd"/>
           </w:p>
         </w:tc>
         <w:tc>
@@ -5526,6 +6625,7 @@
                 <w:lang w:val="es-ES"/>
               </w:rPr>
             </w:pPr>
+            <w:proofErr w:type="spellStart"/>
             <w:r>
               <w:rPr>
                 <w:rFonts w:ascii="Times New Roman" w:hAnsi="Times New Roman" w:cs="Times New Roman"/>
@@ -5535,6 +6635,7 @@
               </w:rPr>
               <w:t>hive-metastore</w:t>
             </w:r>
+            <w:proofErr w:type="spellEnd"/>
           </w:p>
         </w:tc>
         <w:tc>
@@ -5555,7 +6656,23 @@
                 <w:rFonts w:ascii="Times New Roman" w:hAnsi="Times New Roman" w:cs="Times New Roman"/>
                 <w:lang w:val="es-ES"/>
               </w:rPr>
-              <w:t>SERVICE_PRECONDITION=spark-master:7077</w:t>
+              <w:t>SERVICE_PRECONDITION=spark-</w:t>
+            </w:r>
+            <w:proofErr w:type="gramStart"/>
+            <w:r>
+              <w:rPr>
+                <w:rFonts w:ascii="Times New Roman" w:hAnsi="Times New Roman" w:cs="Times New Roman"/>
+                <w:lang w:val="es-ES"/>
+              </w:rPr>
+              <w:t>master</w:t>
+            </w:r>
+            <w:proofErr w:type="gramEnd"/>
+            <w:r>
+              <w:rPr>
+                <w:rFonts w:ascii="Times New Roman" w:hAnsi="Times New Roman" w:cs="Times New Roman"/>
+                <w:lang w:val="es-ES"/>
+              </w:rPr>
+              <w:t>:7077</w:t>
             </w:r>
           </w:p>
         </w:tc>
@@ -5574,6 +6691,7 @@
                 <w:lang w:val="es-ES"/>
               </w:rPr>
             </w:pPr>
+            <w:proofErr w:type="spellStart"/>
             <w:r>
               <w:rPr>
                 <w:rFonts w:ascii="Times New Roman" w:hAnsi="Times New Roman" w:cs="Times New Roman"/>
@@ -5581,7 +6699,17 @@
                 <w:bCs/>
                 <w:lang w:val="es-ES"/>
               </w:rPr>
-              <w:t>hive-server</w:t>
+              <w:t>hive</w:t>
+            </w:r>
+            <w:proofErr w:type="spellEnd"/>
+            <w:r>
+              <w:rPr>
+                <w:rFonts w:ascii="Times New Roman" w:hAnsi="Times New Roman" w:cs="Times New Roman"/>
+                <w:b/>
+                <w:bCs/>
+                <w:lang w:val="es-ES"/>
+              </w:rPr>
+              <w:t>-server</w:t>
             </w:r>
           </w:p>
         </w:tc>
@@ -5641,12 +6769,21 @@
           <w:lang w:val="es-ES"/>
         </w:rPr>
       </w:pPr>
+      <w:proofErr w:type="spellStart"/>
       <w:r>
         <w:rPr>
           <w:rFonts w:ascii="Times New Roman" w:hAnsi="Times New Roman" w:cs="Times New Roman"/>
           <w:lang w:val="es-ES"/>
         </w:rPr>
-        <w:t>docker-compose.yml: define todos los servicios, redes, volúmenes y variables de entorno.</w:t>
+        <w:t>docker-compose.yml</w:t>
+      </w:r>
+      <w:proofErr w:type="spellEnd"/>
+      <w:r>
+        <w:rPr>
+          <w:rFonts w:ascii="Times New Roman" w:hAnsi="Times New Roman" w:cs="Times New Roman"/>
+          <w:lang w:val="es-ES"/>
+        </w:rPr>
+        <w:t>: define todos los servicios, redes, volúmenes y variables de entorno.</w:t>
       </w:r>
     </w:p>
     <w:p>
@@ -5661,12 +6798,21 @@
           <w:lang w:val="es-ES"/>
         </w:rPr>
       </w:pPr>
+      <w:proofErr w:type="spellStart"/>
       <w:r>
         <w:rPr>
           <w:rFonts w:ascii="Times New Roman" w:hAnsi="Times New Roman" w:cs="Times New Roman"/>
           <w:lang w:val="es-ES"/>
         </w:rPr>
-        <w:t>Dockerfile: construye la imagen base utilizada por todos los servicios.</w:t>
+        <w:t>Dockerfile</w:t>
+      </w:r>
+      <w:proofErr w:type="spellEnd"/>
+      <w:r>
+        <w:rPr>
+          <w:rFonts w:ascii="Times New Roman" w:hAnsi="Times New Roman" w:cs="Times New Roman"/>
+          <w:lang w:val="es-ES"/>
+        </w:rPr>
+        <w:t>: construye la imagen base utilizada por todos los servicios.</w:t>
       </w:r>
     </w:p>
     <w:p>
@@ -5681,12 +6827,37 @@
           <w:lang w:val="es-ES"/>
         </w:rPr>
       </w:pPr>
+      <w:proofErr w:type="spellStart"/>
       <w:r>
         <w:rPr>
           <w:rFonts w:ascii="Times New Roman" w:hAnsi="Times New Roman" w:cs="Times New Roman"/>
           <w:lang w:val="es-ES"/>
         </w:rPr>
-        <w:t>config/hadoop/: contiene archivos de configuración de Hadoop (core-site.xml, hdfs-site.xml, yarn-site.xml, etc.).</w:t>
+        <w:t>config</w:t>
+      </w:r>
+      <w:proofErr w:type="spellEnd"/>
+      <w:r>
+        <w:rPr>
+          <w:rFonts w:ascii="Times New Roman" w:hAnsi="Times New Roman" w:cs="Times New Roman"/>
+          <w:lang w:val="es-ES"/>
+        </w:rPr>
+        <w:t>/</w:t>
+      </w:r>
+      <w:proofErr w:type="spellStart"/>
+      <w:r>
+        <w:rPr>
+          <w:rFonts w:ascii="Times New Roman" w:hAnsi="Times New Roman" w:cs="Times New Roman"/>
+          <w:lang w:val="es-ES"/>
+        </w:rPr>
+        <w:t>hadoop</w:t>
+      </w:r>
+      <w:proofErr w:type="spellEnd"/>
+      <w:r>
+        <w:rPr>
+          <w:rFonts w:ascii="Times New Roman" w:hAnsi="Times New Roman" w:cs="Times New Roman"/>
+          <w:lang w:val="es-ES"/>
+        </w:rPr>
+        <w:t>/: contiene archivos de configuración de Hadoop (core-site.xml, hdfs-site.xml, yarn-site.xml, etc.).</w:t>
       </w:r>
     </w:p>
     <w:p>
@@ -5701,12 +6872,53 @@
           <w:lang w:val="es-ES"/>
         </w:rPr>
       </w:pPr>
+      <w:proofErr w:type="spellStart"/>
       <w:r>
         <w:rPr>
           <w:rFonts w:ascii="Times New Roman" w:hAnsi="Times New Roman" w:cs="Times New Roman"/>
           <w:lang w:val="es-ES"/>
         </w:rPr>
-        <w:t>config/spark/: configuración de Spark (spark-defaults.conf, etc.).</w:t>
+        <w:t>config</w:t>
+      </w:r>
+      <w:proofErr w:type="spellEnd"/>
+      <w:r>
+        <w:rPr>
+          <w:rFonts w:ascii="Times New Roman" w:hAnsi="Times New Roman" w:cs="Times New Roman"/>
+          <w:lang w:val="es-ES"/>
+        </w:rPr>
+        <w:t>/</w:t>
+      </w:r>
+      <w:proofErr w:type="spellStart"/>
+      <w:r>
+        <w:rPr>
+          <w:rFonts w:ascii="Times New Roman" w:hAnsi="Times New Roman" w:cs="Times New Roman"/>
+          <w:lang w:val="es-ES"/>
+        </w:rPr>
+        <w:t>spark</w:t>
+      </w:r>
+      <w:proofErr w:type="spellEnd"/>
+      <w:r>
+        <w:rPr>
+          <w:rFonts w:ascii="Times New Roman" w:hAnsi="Times New Roman" w:cs="Times New Roman"/>
+          <w:lang w:val="es-ES"/>
+        </w:rPr>
+        <w:t>/: configuración de Spark (</w:t>
+      </w:r>
+      <w:proofErr w:type="spellStart"/>
+      <w:r>
+        <w:rPr>
+          <w:rFonts w:ascii="Times New Roman" w:hAnsi="Times New Roman" w:cs="Times New Roman"/>
+          <w:lang w:val="es-ES"/>
+        </w:rPr>
+        <w:t>spark-defaults.conf</w:t>
+      </w:r>
+      <w:proofErr w:type="spellEnd"/>
+      <w:r>
+        <w:rPr>
+          <w:rFonts w:ascii="Times New Roman" w:hAnsi="Times New Roman" w:cs="Times New Roman"/>
+          <w:lang w:val="es-ES"/>
+        </w:rPr>
+        <w:t>, etc.).</w:t>
       </w:r>
     </w:p>
     <w:p>
@@ -5721,12 +6933,53 @@
           <w:lang w:val="es-ES"/>
         </w:rPr>
       </w:pPr>
+      <w:proofErr w:type="spellStart"/>
       <w:r>
         <w:rPr>
           <w:rFonts w:ascii="Times New Roman" w:hAnsi="Times New Roman" w:cs="Times New Roman"/>
           <w:lang w:val="es-ES"/>
         </w:rPr>
-        <w:t>config/hive/: configuración de Hive (hive-site.xml, etc.).</w:t>
+        <w:t>config</w:t>
+      </w:r>
+      <w:proofErr w:type="spellEnd"/>
+      <w:r>
+        <w:rPr>
+          <w:rFonts w:ascii="Times New Roman" w:hAnsi="Times New Roman" w:cs="Times New Roman"/>
+          <w:lang w:val="es-ES"/>
+        </w:rPr>
+        <w:t>/</w:t>
+      </w:r>
+      <w:proofErr w:type="spellStart"/>
+      <w:r>
+        <w:rPr>
+          <w:rFonts w:ascii="Times New Roman" w:hAnsi="Times New Roman" w:cs="Times New Roman"/>
+          <w:lang w:val="es-ES"/>
+        </w:rPr>
+        <w:t>hive</w:t>
+      </w:r>
+      <w:proofErr w:type="spellEnd"/>
+      <w:r>
+        <w:rPr>
+          <w:rFonts w:ascii="Times New Roman" w:hAnsi="Times New Roman" w:cs="Times New Roman"/>
+          <w:lang w:val="es-ES"/>
+        </w:rPr>
+        <w:t xml:space="preserve">/: configuración de </w:t>
+      </w:r>
+      <w:proofErr w:type="spellStart"/>
+      <w:r>
+        <w:rPr>
+          <w:rFonts w:ascii="Times New Roman" w:hAnsi="Times New Roman" w:cs="Times New Roman"/>
+          <w:lang w:val="es-ES"/>
+        </w:rPr>
+        <w:t>Hive</w:t>
+      </w:r>
+      <w:proofErr w:type="spellEnd"/>
+      <w:r>
+        <w:rPr>
+          <w:rFonts w:ascii="Times New Roman" w:hAnsi="Times New Roman" w:cs="Times New Roman"/>
+          <w:lang w:val="es-ES"/>
+        </w:rPr>
+        <w:t xml:space="preserve"> (hive-site.xml, etc.).</w:t>
       </w:r>
     </w:p>
     <w:p>
@@ -5766,7 +7019,23 @@
           <w:rFonts w:ascii="Times New Roman" w:hAnsi="Times New Roman" w:cs="Times New Roman"/>
           <w:lang w:val="es-ES"/>
         </w:rPr>
-        <w:t>logs/: directorios para logs de Spark, Hive y YARN.</w:t>
+        <w:t xml:space="preserve">logs/: directorios para logs de Spark, </w:t>
+      </w:r>
+      <w:proofErr w:type="spellStart"/>
+      <w:r>
+        <w:rPr>
+          <w:rFonts w:ascii="Times New Roman" w:hAnsi="Times New Roman" w:cs="Times New Roman"/>
+          <w:lang w:val="es-ES"/>
+        </w:rPr>
+        <w:t>Hive</w:t>
+      </w:r>
+      <w:proofErr w:type="spellEnd"/>
+      <w:r>
+        <w:rPr>
+          <w:rFonts w:ascii="Times New Roman" w:hAnsi="Times New Roman" w:cs="Times New Roman"/>
+          <w:lang w:val="es-ES"/>
+        </w:rPr>
+        <w:t xml:space="preserve"> y YARN.</w:t>
       </w:r>
     </w:p>
     <w:p>
@@ -5909,11 +7178,19 @@
           <w:rFonts w:ascii="Times New Roman" w:hAnsi="Times New Roman" w:cs="Times New Roman"/>
         </w:rPr>
       </w:pPr>
-      <w:r>
-        <w:rPr>
-          <w:rFonts w:ascii="Times New Roman" w:hAnsi="Times New Roman" w:cs="Times New Roman"/>
-        </w:rPr>
-        <w:t>git clone URL_DEL_REPOSITORIO</w:t>
+      <w:proofErr w:type="spellStart"/>
+      <w:r>
+        <w:rPr>
+          <w:rFonts w:ascii="Times New Roman" w:hAnsi="Times New Roman" w:cs="Times New Roman"/>
+        </w:rPr>
+        <w:t>git</w:t>
+      </w:r>
+      <w:proofErr w:type="spellEnd"/>
+      <w:r>
+        <w:rPr>
+          <w:rFonts w:ascii="Times New Roman" w:hAnsi="Times New Roman" w:cs="Times New Roman"/>
+        </w:rPr>
+        <w:t xml:space="preserve"> clone URL_DEL_REPOSITORIO</w:t>
       </w:r>
     </w:p>
     <w:p>
@@ -6069,11 +7346,19 @@
           <w:rFonts w:ascii="Times New Roman" w:hAnsi="Times New Roman" w:cs="Times New Roman"/>
         </w:rPr>
       </w:pPr>
-      <w:r>
-        <w:rPr>
-          <w:rFonts w:ascii="Times New Roman" w:hAnsi="Times New Roman" w:cs="Times New Roman"/>
-        </w:rPr>
-        <w:t>ls -la</w:t>
+      <w:proofErr w:type="spellStart"/>
+      <w:r>
+        <w:rPr>
+          <w:rFonts w:ascii="Times New Roman" w:hAnsi="Times New Roman" w:cs="Times New Roman"/>
+        </w:rPr>
+        <w:t>ls</w:t>
+      </w:r>
+      <w:proofErr w:type="spellEnd"/>
+      <w:r>
+        <w:rPr>
+          <w:rFonts w:ascii="Times New Roman" w:hAnsi="Times New Roman" w:cs="Times New Roman"/>
+        </w:rPr>
+        <w:t xml:space="preserve"> -la</w:t>
       </w:r>
     </w:p>
     <w:p>
@@ -6165,7 +7450,21 @@
         <w:rPr>
           <w:rFonts w:ascii="Times New Roman" w:hAnsi="Times New Roman" w:cs="Times New Roman"/>
         </w:rPr>
-        <w:t>Analizar el archivo de Docker Compose:</w:t>
+        <w:t xml:space="preserve">Analizar el archivo de Docker </w:t>
+      </w:r>
+      <w:proofErr w:type="spellStart"/>
+      <w:r>
+        <w:rPr>
+          <w:rFonts w:ascii="Times New Roman" w:hAnsi="Times New Roman" w:cs="Times New Roman"/>
+        </w:rPr>
+        <w:t>Compose</w:t>
+      </w:r>
+      <w:proofErr w:type="spellEnd"/>
+      <w:r>
+        <w:rPr>
+          <w:rFonts w:ascii="Times New Roman" w:hAnsi="Times New Roman" w:cs="Times New Roman"/>
+        </w:rPr>
+        <w:t>:</w:t>
       </w:r>
     </w:p>
     <w:p>
@@ -6175,12 +7474,28 @@
           <w:rFonts w:ascii="Times New Roman" w:hAnsi="Times New Roman" w:cs="Times New Roman"/>
         </w:rPr>
       </w:pPr>
-      <w:r>
-        <w:rPr>
-          <w:rFonts w:ascii="Times New Roman" w:hAnsi="Times New Roman" w:cs="Times New Roman"/>
-        </w:rPr>
-        <w:t>cat docker-compose.yml</w:t>
-      </w:r>
+      <w:proofErr w:type="spellStart"/>
+      <w:r>
+        <w:rPr>
+          <w:rFonts w:ascii="Times New Roman" w:hAnsi="Times New Roman" w:cs="Times New Roman"/>
+        </w:rPr>
+        <w:t>cat</w:t>
+      </w:r>
+      <w:proofErr w:type="spellEnd"/>
+      <w:r>
+        <w:rPr>
+          <w:rFonts w:ascii="Times New Roman" w:hAnsi="Times New Roman" w:cs="Times New Roman"/>
+        </w:rPr>
+        <w:t xml:space="preserve"> </w:t>
+      </w:r>
+      <w:proofErr w:type="spellStart"/>
+      <w:r>
+        <w:rPr>
+          <w:rFonts w:ascii="Times New Roman" w:hAnsi="Times New Roman" w:cs="Times New Roman"/>
+        </w:rPr>
+        <w:t>docker-compose.yml</w:t>
+      </w:r>
+      <w:proofErr w:type="spellEnd"/>
     </w:p>
     <w:p>
       <w:pPr>
@@ -6294,11 +7609,33 @@
           <w:rFonts w:ascii="Times New Roman" w:hAnsi="Times New Roman" w:cs="Times New Roman"/>
         </w:rPr>
       </w:pPr>
-      <w:r>
-        <w:rPr>
-          <w:rFonts w:ascii="Times New Roman" w:hAnsi="Times New Roman" w:cs="Times New Roman"/>
-        </w:rPr>
-        <w:t>docker compose up -d</w:t>
+      <w:proofErr w:type="spellStart"/>
+      <w:r>
+        <w:rPr>
+          <w:rFonts w:ascii="Times New Roman" w:hAnsi="Times New Roman" w:cs="Times New Roman"/>
+        </w:rPr>
+        <w:t>docker</w:t>
+      </w:r>
+      <w:proofErr w:type="spellEnd"/>
+      <w:r>
+        <w:rPr>
+          <w:rFonts w:ascii="Times New Roman" w:hAnsi="Times New Roman" w:cs="Times New Roman"/>
+        </w:rPr>
+        <w:t xml:space="preserve"> </w:t>
+      </w:r>
+      <w:proofErr w:type="spellStart"/>
+      <w:r>
+        <w:rPr>
+          <w:rFonts w:ascii="Times New Roman" w:hAnsi="Times New Roman" w:cs="Times New Roman"/>
+        </w:rPr>
+        <w:t>compose</w:t>
+      </w:r>
+      <w:proofErr w:type="spellEnd"/>
+      <w:r>
+        <w:rPr>
+          <w:rFonts w:ascii="Times New Roman" w:hAnsi="Times New Roman" w:cs="Times New Roman"/>
+        </w:rPr>
+        <w:t xml:space="preserve"> up -d</w:t>
       </w:r>
     </w:p>
     <w:p>
@@ -6351,12 +7688,28 @@
           <w:rFonts w:ascii="Times New Roman" w:hAnsi="Times New Roman" w:cs="Times New Roman"/>
         </w:rPr>
       </w:pPr>
-      <w:r>
-        <w:rPr>
-          <w:rFonts w:ascii="Times New Roman" w:hAnsi="Times New Roman" w:cs="Times New Roman"/>
-        </w:rPr>
-        <w:t>docker ps</w:t>
-      </w:r>
+      <w:proofErr w:type="spellStart"/>
+      <w:r>
+        <w:rPr>
+          <w:rFonts w:ascii="Times New Roman" w:hAnsi="Times New Roman" w:cs="Times New Roman"/>
+        </w:rPr>
+        <w:t>docker</w:t>
+      </w:r>
+      <w:proofErr w:type="spellEnd"/>
+      <w:r>
+        <w:rPr>
+          <w:rFonts w:ascii="Times New Roman" w:hAnsi="Times New Roman" w:cs="Times New Roman"/>
+        </w:rPr>
+        <w:t xml:space="preserve"> </w:t>
+      </w:r>
+      <w:proofErr w:type="spellStart"/>
+      <w:r>
+        <w:rPr>
+          <w:rFonts w:ascii="Times New Roman" w:hAnsi="Times New Roman" w:cs="Times New Roman"/>
+        </w:rPr>
+        <w:t>ps</w:t>
+      </w:r>
+      <w:proofErr w:type="spellEnd"/>
     </w:p>
     <w:p>
       <w:pPr>
@@ -6415,6 +7768,7 @@
       <w:r>
         <w:rPr>
           <w:rFonts w:ascii="Times New Roman" w:hAnsi="Times New Roman" w:cs="Times New Roman"/>
+          <w:noProof/>
         </w:rPr>
         <w:drawing>
           <wp:inline distT="0" distB="0" distL="0" distR="0" wp14:anchorId="2F13CA55" wp14:editId="09E869EA">
@@ -6506,6 +7860,7 @@
       <w:r>
         <w:rPr>
           <w:rFonts w:ascii="Times New Roman" w:hAnsi="Times New Roman" w:cs="Times New Roman"/>
+          <w:noProof/>
         </w:rPr>
         <w:lastRenderedPageBreak/>
         <w:drawing>
@@ -6555,6 +7910,7 @@
       <w:r>
         <w:rPr>
           <w:rFonts w:ascii="Times New Roman" w:hAnsi="Times New Roman" w:cs="Times New Roman"/>
+          <w:noProof/>
         </w:rPr>
         <w:drawing>
           <wp:inline distT="0" distB="0" distL="0" distR="0" wp14:anchorId="3E85D759" wp14:editId="2FA3390A">
@@ -6766,6 +8122,7 @@
       <w:r>
         <w:rPr>
           <w:rFonts w:ascii="Times New Roman" w:hAnsi="Times New Roman" w:cs="Times New Roman"/>
+          <w:noProof/>
         </w:rPr>
         <w:lastRenderedPageBreak/>
         <w:drawing>
@@ -6851,8 +8208,20 @@
           <w:sz w:val="22"/>
           <w:szCs w:val="22"/>
         </w:rPr>
-        <w:t>8. Comparación con docker-hadoop</w:t>
-      </w:r>
+        <w:t xml:space="preserve">8. Comparación con </w:t>
+      </w:r>
+      <w:proofErr w:type="spellStart"/>
+      <w:r>
+        <w:rPr>
+          <w:rFonts w:ascii="Times New Roman" w:hAnsi="Times New Roman" w:cs="Times New Roman"/>
+          <w:b/>
+          <w:bCs/>
+          <w:sz w:val="22"/>
+          <w:szCs w:val="22"/>
+        </w:rPr>
+        <w:t>docker-hadoop</w:t>
+      </w:r>
+      <w:proofErr w:type="spellEnd"/>
     </w:p>
     <w:p>
       <w:pPr>
@@ -7005,6 +8374,7 @@
                 <w:rFonts w:ascii="Times New Roman" w:hAnsi="Times New Roman" w:cs="Times New Roman"/>
               </w:rPr>
             </w:pPr>
+            <w:proofErr w:type="spellStart"/>
             <w:r>
               <w:rPr>
                 <w:rFonts w:ascii="Times New Roman" w:hAnsi="Times New Roman" w:cs="Times New Roman"/>
@@ -7013,6 +8383,7 @@
               </w:rPr>
               <w:t>docker-hadoop</w:t>
             </w:r>
+            <w:proofErr w:type="spellEnd"/>
           </w:p>
         </w:tc>
         <w:tc>
@@ -7038,6 +8409,7 @@
                 <w:rFonts w:ascii="Times New Roman" w:hAnsi="Times New Roman" w:cs="Times New Roman"/>
               </w:rPr>
             </w:pPr>
+            <w:proofErr w:type="spellStart"/>
             <w:r>
               <w:rPr>
                 <w:rFonts w:ascii="Times New Roman" w:hAnsi="Times New Roman" w:cs="Times New Roman"/>
@@ -7046,6 +8418,7 @@
               </w:rPr>
               <w:t>DockerSpark</w:t>
             </w:r>
+            <w:proofErr w:type="spellEnd"/>
           </w:p>
         </w:tc>
       </w:tr>
@@ -7141,7 +8514,23 @@
                 <w:rFonts w:ascii="Times New Roman" w:hAnsi="Times New Roman" w:cs="Times New Roman"/>
                 <w:lang w:val="es-ES"/>
               </w:rPr>
-              <w:t>Apache Spark (procesamiento en memoria) + Hadoop (HDFS) + Hive (SQL)</w:t>
+              <w:t xml:space="preserve">Apache Spark (procesamiento en memoria) + Hadoop (HDFS) + </w:t>
+            </w:r>
+            <w:proofErr w:type="spellStart"/>
+            <w:r>
+              <w:rPr>
+                <w:rFonts w:ascii="Times New Roman" w:hAnsi="Times New Roman" w:cs="Times New Roman"/>
+                <w:lang w:val="es-ES"/>
+              </w:rPr>
+              <w:t>Hive</w:t>
+            </w:r>
+            <w:proofErr w:type="spellEnd"/>
+            <w:r>
+              <w:rPr>
+                <w:rFonts w:ascii="Times New Roman" w:hAnsi="Times New Roman" w:cs="Times New Roman"/>
+                <w:lang w:val="es-ES"/>
+              </w:rPr>
+              <w:t xml:space="preserve"> (SQL)</w:t>
             </w:r>
           </w:p>
         </w:tc>
@@ -7271,8 +8660,16 @@
               <w:rPr>
                 <w:rFonts w:ascii="Times New Roman" w:hAnsi="Times New Roman" w:cs="Times New Roman"/>
               </w:rPr>
-              <w:t>Docker Compose</w:t>
-            </w:r>
+              <w:t xml:space="preserve">Docker </w:t>
+            </w:r>
+            <w:proofErr w:type="spellStart"/>
+            <w:r>
+              <w:rPr>
+                <w:rFonts w:ascii="Times New Roman" w:hAnsi="Times New Roman" w:cs="Times New Roman"/>
+              </w:rPr>
+              <w:t>Compose</w:t>
+            </w:r>
+            <w:proofErr w:type="spellEnd"/>
           </w:p>
         </w:tc>
         <w:tc>
@@ -7398,7 +8795,87 @@
                 <w:rFonts w:ascii="Times New Roman" w:hAnsi="Times New Roman" w:cs="Times New Roman"/>
                 <w:lang w:val="en-US"/>
               </w:rPr>
-              <w:t>5 (NameNode, DataNode, ResourceManager, NodeManager, HistoryServer)</w:t>
+              <w:t>5 (</w:t>
+            </w:r>
+            <w:proofErr w:type="spellStart"/>
+            <w:r>
+              <w:rPr>
+                <w:rFonts w:ascii="Times New Roman" w:hAnsi="Times New Roman" w:cs="Times New Roman"/>
+                <w:lang w:val="en-US"/>
+              </w:rPr>
+              <w:t>NameNode</w:t>
+            </w:r>
+            <w:proofErr w:type="spellEnd"/>
+            <w:r>
+              <w:rPr>
+                <w:rFonts w:ascii="Times New Roman" w:hAnsi="Times New Roman" w:cs="Times New Roman"/>
+                <w:lang w:val="en-US"/>
+              </w:rPr>
+              <w:t xml:space="preserve">, </w:t>
+            </w:r>
+            <w:proofErr w:type="spellStart"/>
+            <w:r>
+              <w:rPr>
+                <w:rFonts w:ascii="Times New Roman" w:hAnsi="Times New Roman" w:cs="Times New Roman"/>
+                <w:lang w:val="en-US"/>
+              </w:rPr>
+              <w:t>DataNode</w:t>
+            </w:r>
+            <w:proofErr w:type="spellEnd"/>
+            <w:r>
+              <w:rPr>
+                <w:rFonts w:ascii="Times New Roman" w:hAnsi="Times New Roman" w:cs="Times New Roman"/>
+                <w:lang w:val="en-US"/>
+              </w:rPr>
+              <w:t xml:space="preserve">, </w:t>
+            </w:r>
+            <w:proofErr w:type="spellStart"/>
+            <w:r>
+              <w:rPr>
+                <w:rFonts w:ascii="Times New Roman" w:hAnsi="Times New Roman" w:cs="Times New Roman"/>
+                <w:lang w:val="en-US"/>
+              </w:rPr>
+              <w:t>ResourceManager</w:t>
+            </w:r>
+            <w:proofErr w:type="spellEnd"/>
+            <w:r>
+              <w:rPr>
+                <w:rFonts w:ascii="Times New Roman" w:hAnsi="Times New Roman" w:cs="Times New Roman"/>
+                <w:lang w:val="en-US"/>
+              </w:rPr>
+              <w:t xml:space="preserve">, </w:t>
+            </w:r>
+            <w:proofErr w:type="spellStart"/>
+            <w:r>
+              <w:rPr>
+                <w:rFonts w:ascii="Times New Roman" w:hAnsi="Times New Roman" w:cs="Times New Roman"/>
+                <w:lang w:val="en-US"/>
+              </w:rPr>
+              <w:t>NodeManager</w:t>
+            </w:r>
+            <w:proofErr w:type="spellEnd"/>
+            <w:r>
+              <w:rPr>
+                <w:rFonts w:ascii="Times New Roman" w:hAnsi="Times New Roman" w:cs="Times New Roman"/>
+                <w:lang w:val="en-US"/>
+              </w:rPr>
+              <w:t xml:space="preserve">, </w:t>
+            </w:r>
+            <w:proofErr w:type="spellStart"/>
+            <w:r>
+              <w:rPr>
+                <w:rFonts w:ascii="Times New Roman" w:hAnsi="Times New Roman" w:cs="Times New Roman"/>
+                <w:lang w:val="en-US"/>
+              </w:rPr>
+              <w:t>HistoryServer</w:t>
+            </w:r>
+            <w:proofErr w:type="spellEnd"/>
+            <w:r>
+              <w:rPr>
+                <w:rFonts w:ascii="Times New Roman" w:hAnsi="Times New Roman" w:cs="Times New Roman"/>
+                <w:lang w:val="en-US"/>
+              </w:rPr>
+              <w:t>)</w:t>
             </w:r>
           </w:p>
         </w:tc>
@@ -7430,7 +8907,55 @@
                 <w:rFonts w:ascii="Times New Roman" w:hAnsi="Times New Roman" w:cs="Times New Roman"/>
                 <w:lang w:val="en-US"/>
               </w:rPr>
-              <w:t>6 (ResourceManager, NodeManager, Spark Master, Spark Worker, Hive Metastore, Hive Server)</w:t>
+              <w:t>6 (</w:t>
+            </w:r>
+            <w:proofErr w:type="spellStart"/>
+            <w:r>
+              <w:rPr>
+                <w:rFonts w:ascii="Times New Roman" w:hAnsi="Times New Roman" w:cs="Times New Roman"/>
+                <w:lang w:val="en-US"/>
+              </w:rPr>
+              <w:t>ResourceManager</w:t>
+            </w:r>
+            <w:proofErr w:type="spellEnd"/>
+            <w:r>
+              <w:rPr>
+                <w:rFonts w:ascii="Times New Roman" w:hAnsi="Times New Roman" w:cs="Times New Roman"/>
+                <w:lang w:val="en-US"/>
+              </w:rPr>
+              <w:t xml:space="preserve">, </w:t>
+            </w:r>
+            <w:proofErr w:type="spellStart"/>
+            <w:r>
+              <w:rPr>
+                <w:rFonts w:ascii="Times New Roman" w:hAnsi="Times New Roman" w:cs="Times New Roman"/>
+                <w:lang w:val="en-US"/>
+              </w:rPr>
+              <w:t>NodeManager</w:t>
+            </w:r>
+            <w:proofErr w:type="spellEnd"/>
+            <w:r>
+              <w:rPr>
+                <w:rFonts w:ascii="Times New Roman" w:hAnsi="Times New Roman" w:cs="Times New Roman"/>
+                <w:lang w:val="en-US"/>
+              </w:rPr>
+              <w:t xml:space="preserve">, Spark Master, Spark Worker, Hive </w:t>
+            </w:r>
+            <w:proofErr w:type="spellStart"/>
+            <w:r>
+              <w:rPr>
+                <w:rFonts w:ascii="Times New Roman" w:hAnsi="Times New Roman" w:cs="Times New Roman"/>
+                <w:lang w:val="en-US"/>
+              </w:rPr>
+              <w:t>Metastore</w:t>
+            </w:r>
+            <w:proofErr w:type="spellEnd"/>
+            <w:r>
+              <w:rPr>
+                <w:rFonts w:ascii="Times New Roman" w:hAnsi="Times New Roman" w:cs="Times New Roman"/>
+                <w:lang w:val="en-US"/>
+              </w:rPr>
+              <w:t>, Hive Server)</w:t>
             </w:r>
           </w:p>
         </w:tc>
@@ -7527,7 +9052,23 @@
                 <w:rFonts w:ascii="Times New Roman" w:hAnsi="Times New Roman" w:cs="Times New Roman"/>
                 <w:lang w:val="es-ES"/>
               </w:rPr>
-              <w:t>Sí (HDFS integrado con Spark y Hive)</w:t>
+              <w:t xml:space="preserve">Sí (HDFS integrado con Spark y </w:t>
+            </w:r>
+            <w:proofErr w:type="spellStart"/>
+            <w:r>
+              <w:rPr>
+                <w:rFonts w:ascii="Times New Roman" w:hAnsi="Times New Roman" w:cs="Times New Roman"/>
+                <w:lang w:val="es-ES"/>
+              </w:rPr>
+              <w:t>Hive</w:t>
+            </w:r>
+            <w:proofErr w:type="spellEnd"/>
+            <w:r>
+              <w:rPr>
+                <w:rFonts w:ascii="Times New Roman" w:hAnsi="Times New Roman" w:cs="Times New Roman"/>
+                <w:lang w:val="es-ES"/>
+              </w:rPr>
+              <w:t>)</w:t>
             </w:r>
           </w:p>
         </w:tc>
@@ -7687,12 +9228,85 @@
                 <w:lang w:val="en-US"/>
               </w:rPr>
             </w:pPr>
+            <w:proofErr w:type="spellStart"/>
             <w:r>
               <w:rPr>
                 <w:rFonts w:ascii="Times New Roman" w:hAnsi="Times New Roman" w:cs="Times New Roman"/>
                 <w:lang w:val="en-US"/>
               </w:rPr>
-              <w:t>NameNode (9870), HistoryServer (8188), DataNode (9864), NodeManager (8042), ResourceManager (8088)</w:t>
+              <w:t>NameNode</w:t>
+            </w:r>
+            <w:proofErr w:type="spellEnd"/>
+            <w:r>
+              <w:rPr>
+                <w:rFonts w:ascii="Times New Roman" w:hAnsi="Times New Roman" w:cs="Times New Roman"/>
+                <w:lang w:val="en-US"/>
+              </w:rPr>
+              <w:t xml:space="preserve"> (9870), </w:t>
+            </w:r>
+            <w:proofErr w:type="spellStart"/>
+            <w:r>
+              <w:rPr>
+                <w:rFonts w:ascii="Times New Roman" w:hAnsi="Times New Roman" w:cs="Times New Roman"/>
+                <w:lang w:val="en-US"/>
+              </w:rPr>
+              <w:t>HistoryServer</w:t>
+            </w:r>
+            <w:proofErr w:type="spellEnd"/>
+            <w:r>
+              <w:rPr>
+                <w:rFonts w:ascii="Times New Roman" w:hAnsi="Times New Roman" w:cs="Times New Roman"/>
+                <w:lang w:val="en-US"/>
+              </w:rPr>
+              <w:t xml:space="preserve"> (8188), </w:t>
+            </w:r>
+            <w:proofErr w:type="spellStart"/>
+            <w:r>
+              <w:rPr>
+                <w:rFonts w:ascii="Times New Roman" w:hAnsi="Times New Roman" w:cs="Times New Roman"/>
+                <w:lang w:val="en-US"/>
+              </w:rPr>
+              <w:t>DataNode</w:t>
+            </w:r>
+            <w:proofErr w:type="spellEnd"/>
+            <w:r>
+              <w:rPr>
+                <w:rFonts w:ascii="Times New Roman" w:hAnsi="Times New Roman" w:cs="Times New Roman"/>
+                <w:lang w:val="en-US"/>
+              </w:rPr>
+              <w:t xml:space="preserve"> (9864), </w:t>
+            </w:r>
+            <w:proofErr w:type="spellStart"/>
+            <w:r>
+              <w:rPr>
+                <w:rFonts w:ascii="Times New Roman" w:hAnsi="Times New Roman" w:cs="Times New Roman"/>
+                <w:lang w:val="en-US"/>
+              </w:rPr>
+              <w:t>NodeManager</w:t>
+            </w:r>
+            <w:proofErr w:type="spellEnd"/>
+            <w:r>
+              <w:rPr>
+                <w:rFonts w:ascii="Times New Roman" w:hAnsi="Times New Roman" w:cs="Times New Roman"/>
+                <w:lang w:val="en-US"/>
+              </w:rPr>
+              <w:t xml:space="preserve"> (8042), </w:t>
+            </w:r>
+            <w:proofErr w:type="spellStart"/>
+            <w:r>
+              <w:rPr>
+                <w:rFonts w:ascii="Times New Roman" w:hAnsi="Times New Roman" w:cs="Times New Roman"/>
+                <w:lang w:val="en-US"/>
+              </w:rPr>
+              <w:t>ResourceManager</w:t>
+            </w:r>
+            <w:proofErr w:type="spellEnd"/>
+            <w:r>
+              <w:rPr>
+                <w:rFonts w:ascii="Times New Roman" w:hAnsi="Times New Roman" w:cs="Times New Roman"/>
+                <w:lang w:val="en-US"/>
+              </w:rPr>
+              <w:t xml:space="preserve"> (8088)</w:t>
             </w:r>
           </w:p>
         </w:tc>
@@ -7724,7 +9338,39 @@
                 <w:rFonts w:ascii="Times New Roman" w:hAnsi="Times New Roman" w:cs="Times New Roman"/>
                 <w:lang w:val="en-US"/>
               </w:rPr>
-              <w:t>Spark Master UI (8082), YARN UI (8088), HiveServer2 UI (10002), Hive Metastore (9083), Spark Worker UI (8081), NodeManager UI (8042)</w:t>
+              <w:t xml:space="preserve">Spark Master UI (8082), YARN UI (8088), HiveServer2 UI (10002), Hive </w:t>
+            </w:r>
+            <w:proofErr w:type="spellStart"/>
+            <w:r>
+              <w:rPr>
+                <w:rFonts w:ascii="Times New Roman" w:hAnsi="Times New Roman" w:cs="Times New Roman"/>
+                <w:lang w:val="en-US"/>
+              </w:rPr>
+              <w:t>Metastore</w:t>
+            </w:r>
+            <w:proofErr w:type="spellEnd"/>
+            <w:r>
+              <w:rPr>
+                <w:rFonts w:ascii="Times New Roman" w:hAnsi="Times New Roman" w:cs="Times New Roman"/>
+                <w:lang w:val="en-US"/>
+              </w:rPr>
+              <w:t xml:space="preserve"> (9083), Spark Worker UI (8081), </w:t>
+            </w:r>
+            <w:proofErr w:type="spellStart"/>
+            <w:r>
+              <w:rPr>
+                <w:rFonts w:ascii="Times New Roman" w:hAnsi="Times New Roman" w:cs="Times New Roman"/>
+                <w:lang w:val="en-US"/>
+              </w:rPr>
+              <w:t>NodeManager</w:t>
+            </w:r>
+            <w:proofErr w:type="spellEnd"/>
+            <w:r>
+              <w:rPr>
+                <w:rFonts w:ascii="Times New Roman" w:hAnsi="Times New Roman" w:cs="Times New Roman"/>
+                <w:lang w:val="en-US"/>
+              </w:rPr>
+              <w:t xml:space="preserve"> UI (8042)</w:t>
             </w:r>
           </w:p>
         </w:tc>
@@ -7887,7 +9533,23 @@
                 <w:rFonts w:ascii="Times New Roman" w:hAnsi="Times New Roman" w:cs="Times New Roman"/>
                 <w:lang w:val="es-ES"/>
               </w:rPr>
-              <w:t>Media. Solo requiere un comando docker-compose up -d.</w:t>
+              <w:t xml:space="preserve">Media. Solo requiere un comando </w:t>
+            </w:r>
+            <w:proofErr w:type="spellStart"/>
+            <w:r>
+              <w:rPr>
+                <w:rFonts w:ascii="Times New Roman" w:hAnsi="Times New Roman" w:cs="Times New Roman"/>
+                <w:lang w:val="es-ES"/>
+              </w:rPr>
+              <w:t>docker-compose</w:t>
+            </w:r>
+            <w:proofErr w:type="spellEnd"/>
+            <w:r>
+              <w:rPr>
+                <w:rFonts w:ascii="Times New Roman" w:hAnsi="Times New Roman" w:cs="Times New Roman"/>
+                <w:lang w:val="es-ES"/>
+              </w:rPr>
+              <w:t xml:space="preserve"> up -d.</w:t>
             </w:r>
           </w:p>
         </w:tc>
@@ -7984,7 +9646,23 @@
                 <w:rFonts w:ascii="Times New Roman" w:hAnsi="Times New Roman" w:cs="Times New Roman"/>
                 <w:lang w:val="es-ES"/>
               </w:rPr>
-              <w:t>Buena, en inglés. Enfocada en HDFS y MapReduce. Incluye ejemplos como wordcount.</w:t>
+              <w:t xml:space="preserve">Buena, en inglés. Enfocada en HDFS y MapReduce. Incluye ejemplos como </w:t>
+            </w:r>
+            <w:proofErr w:type="spellStart"/>
+            <w:r>
+              <w:rPr>
+                <w:rFonts w:ascii="Times New Roman" w:hAnsi="Times New Roman" w:cs="Times New Roman"/>
+                <w:lang w:val="es-ES"/>
+              </w:rPr>
+              <w:t>wordcount</w:t>
+            </w:r>
+            <w:proofErr w:type="spellEnd"/>
+            <w:r>
+              <w:rPr>
+                <w:rFonts w:ascii="Times New Roman" w:hAnsi="Times New Roman" w:cs="Times New Roman"/>
+                <w:lang w:val="es-ES"/>
+              </w:rPr>
+              <w:t>.</w:t>
             </w:r>
           </w:p>
         </w:tc>
@@ -8015,7 +9693,23 @@
                 <w:rFonts w:ascii="Times New Roman" w:hAnsi="Times New Roman" w:cs="Times New Roman"/>
                 <w:lang w:val="es-ES"/>
               </w:rPr>
-              <w:t>Buena, en inglés. Incluye guías para Spark, Hive y YARN.</w:t>
+              <w:t xml:space="preserve">Buena, en inglés. Incluye guías para Spark, </w:t>
+            </w:r>
+            <w:proofErr w:type="spellStart"/>
+            <w:r>
+              <w:rPr>
+                <w:rFonts w:ascii="Times New Roman" w:hAnsi="Times New Roman" w:cs="Times New Roman"/>
+                <w:lang w:val="es-ES"/>
+              </w:rPr>
+              <w:t>Hive</w:t>
+            </w:r>
+            <w:proofErr w:type="spellEnd"/>
+            <w:r>
+              <w:rPr>
+                <w:rFonts w:ascii="Times New Roman" w:hAnsi="Times New Roman" w:cs="Times New Roman"/>
+                <w:lang w:val="es-ES"/>
+              </w:rPr>
+              <w:t xml:space="preserve"> y YARN.</w:t>
             </w:r>
           </w:p>
         </w:tc>
@@ -8112,7 +9806,23 @@
                 <w:rFonts w:ascii="Times New Roman" w:hAnsi="Times New Roman" w:cs="Times New Roman"/>
                 <w:lang w:val="es-ES"/>
               </w:rPr>
-              <w:t>Análisis de datos avanzado con Spark SQL/Hive y procesamiento en memoria. Ideal para pipelines de datos más complejos.</w:t>
+              <w:t>Análisis de datos avanzado con Spark SQL/</w:t>
+            </w:r>
+            <w:proofErr w:type="spellStart"/>
+            <w:r>
+              <w:rPr>
+                <w:rFonts w:ascii="Times New Roman" w:hAnsi="Times New Roman" w:cs="Times New Roman"/>
+                <w:lang w:val="es-ES"/>
+              </w:rPr>
+              <w:t>Hive</w:t>
+            </w:r>
+            <w:proofErr w:type="spellEnd"/>
+            <w:r>
+              <w:rPr>
+                <w:rFonts w:ascii="Times New Roman" w:hAnsi="Times New Roman" w:cs="Times New Roman"/>
+                <w:lang w:val="es-ES"/>
+              </w:rPr>
+              <w:t xml:space="preserve"> y procesamiento en memoria. Ideal para pipelines de datos más complejos.</w:t>
             </w:r>
           </w:p>
         </w:tc>
@@ -8163,7 +9873,55 @@
           <w:rFonts w:ascii="Times New Roman" w:hAnsi="Times New Roman" w:cs="Times New Roman"/>
           <w:lang w:val="es-ES"/>
         </w:rPr>
-        <w:t>Mientras docker-hadoop es un entorno más simple y enfocado en el almacenamiento y procesamiento batch clásico, DockerSpark ofrece un ecosistema más completo orientado al análisis interactivo y al procesamiento en memoria.</w:t>
+        <w:t xml:space="preserve">Mientras </w:t>
+      </w:r>
+      <w:proofErr w:type="spellStart"/>
+      <w:r>
+        <w:rPr>
+          <w:rFonts w:ascii="Times New Roman" w:hAnsi="Times New Roman" w:cs="Times New Roman"/>
+          <w:lang w:val="es-ES"/>
+        </w:rPr>
+        <w:t>docker-hadoop</w:t>
+      </w:r>
+      <w:proofErr w:type="spellEnd"/>
+      <w:r>
+        <w:rPr>
+          <w:rFonts w:ascii="Times New Roman" w:hAnsi="Times New Roman" w:cs="Times New Roman"/>
+          <w:lang w:val="es-ES"/>
+        </w:rPr>
+        <w:t xml:space="preserve"> es un entorno más simple y enfocado en el almacenamiento y procesamiento </w:t>
+      </w:r>
+      <w:proofErr w:type="spellStart"/>
+      <w:r>
+        <w:rPr>
+          <w:rFonts w:ascii="Times New Roman" w:hAnsi="Times New Roman" w:cs="Times New Roman"/>
+          <w:lang w:val="es-ES"/>
+        </w:rPr>
+        <w:t>batch</w:t>
+      </w:r>
+      <w:proofErr w:type="spellEnd"/>
+      <w:r>
+        <w:rPr>
+          <w:rFonts w:ascii="Times New Roman" w:hAnsi="Times New Roman" w:cs="Times New Roman"/>
+          <w:lang w:val="es-ES"/>
+        </w:rPr>
+        <w:t xml:space="preserve"> clásico, </w:t>
+      </w:r>
+      <w:proofErr w:type="spellStart"/>
+      <w:r>
+        <w:rPr>
+          <w:rFonts w:ascii="Times New Roman" w:hAnsi="Times New Roman" w:cs="Times New Roman"/>
+          <w:lang w:val="es-ES"/>
+        </w:rPr>
+        <w:t>DockerSpark</w:t>
+      </w:r>
+      <w:proofErr w:type="spellEnd"/>
+      <w:r>
+        <w:rPr>
+          <w:rFonts w:ascii="Times New Roman" w:hAnsi="Times New Roman" w:cs="Times New Roman"/>
+          <w:lang w:val="es-ES"/>
+        </w:rPr>
+        <w:t xml:space="preserve"> ofrece un ecosistema más completo orientado al análisis interactivo y al procesamiento en memoria.</w:t>
       </w:r>
     </w:p>
     <w:p>
@@ -8329,8 +10087,20 @@
           <w:sz w:val="22"/>
           <w:szCs w:val="22"/>
         </w:rPr>
-        <w:t>10. Entrega de trabajo en github</w:t>
-      </w:r>
+        <w:t xml:space="preserve">10. Entrega de trabajo en </w:t>
+      </w:r>
+      <w:proofErr w:type="spellStart"/>
+      <w:r>
+        <w:rPr>
+          <w:rFonts w:ascii="Times New Roman" w:hAnsi="Times New Roman" w:cs="Times New Roman"/>
+          <w:b/>
+          <w:bCs/>
+          <w:sz w:val="22"/>
+          <w:szCs w:val="22"/>
+        </w:rPr>
+        <w:t>github</w:t>
+      </w:r>
+      <w:proofErr w:type="spellEnd"/>
     </w:p>
     <w:p>
       <w:pPr>
@@ -8417,6 +10187,7 @@
         </w:rPr>
         <w:t>Archivos de configuración utilizados (</w:t>
       </w:r>
+      <w:proofErr w:type="spellStart"/>
       <w:r>
         <w:rPr>
           <w:rFonts w:ascii="Times New Roman" w:eastAsia="Roboto Mono" w:hAnsi="Times New Roman" w:cs="Times New Roman"/>
@@ -8424,11 +10195,26 @@
         </w:rPr>
         <w:t>docker-compose.yml</w:t>
       </w:r>
-      <w:r>
-        <w:rPr>
-          <w:rFonts w:ascii="Times New Roman" w:hAnsi="Times New Roman" w:cs="Times New Roman"/>
-        </w:rPr>
-        <w:t>, Dockerfile, etc.).</w:t>
+      <w:proofErr w:type="spellEnd"/>
+      <w:r>
+        <w:rPr>
+          <w:rFonts w:ascii="Times New Roman" w:hAnsi="Times New Roman" w:cs="Times New Roman"/>
+        </w:rPr>
+        <w:t xml:space="preserve">, </w:t>
+      </w:r>
+      <w:proofErr w:type="spellStart"/>
+      <w:r>
+        <w:rPr>
+          <w:rFonts w:ascii="Times New Roman" w:hAnsi="Times New Roman" w:cs="Times New Roman"/>
+        </w:rPr>
+        <w:t>Dockerfile</w:t>
+      </w:r>
+      <w:proofErr w:type="spellEnd"/>
+      <w:r>
+        <w:rPr>
+          <w:rFonts w:ascii="Times New Roman" w:hAnsi="Times New Roman" w:cs="Times New Roman"/>
+        </w:rPr>
+        <w:t>, etc.).</w:t>
       </w:r>
     </w:p>
     <w:p>
@@ -8572,6 +10358,7 @@
         </w:rPr>
         <w:br/>
       </w:r>
+      <w:proofErr w:type="spellStart"/>
       <w:r>
         <w:rPr>
           <w:rFonts w:ascii="Times New Roman" w:eastAsia="Roboto Mono" w:hAnsi="Times New Roman" w:cs="Times New Roman"/>
@@ -8579,6 +10366,7 @@
         </w:rPr>
         <w:t>bigdata-numero_de_grupo</w:t>
       </w:r>
+      <w:proofErr w:type="spellEnd"/>
     </w:p>
     <w:p>
       <w:pPr>
@@ -8604,8 +10392,18 @@
           <w:b/>
           <w:bCs/>
         </w:rPr>
-        <w:t>3 commits</w:t>
-      </w:r>
+        <w:t xml:space="preserve">3 </w:t>
+      </w:r>
+      <w:proofErr w:type="spellStart"/>
+      <w:r>
+        <w:rPr>
+          <w:rFonts w:ascii="Times New Roman" w:hAnsi="Times New Roman" w:cs="Times New Roman"/>
+          <w:b/>
+          <w:bCs/>
+        </w:rPr>
+        <w:t>commits</w:t>
+      </w:r>
+      <w:proofErr w:type="spellEnd"/>
       <w:r>
         <w:rPr>
           <w:rFonts w:ascii="Times New Roman" w:hAnsi="Times New Roman" w:cs="Times New Roman"/>
@@ -11158,6 +12956,7 @@
   <w:style w:type="character" w:default="1" w:styleId="Fuentedeprrafopredeter">
     <w:name w:val="Default Paragraph Font"/>
     <w:uiPriority w:val="1"/>
+    <w:semiHidden/>
     <w:unhideWhenUsed/>
   </w:style>
   <w:style w:type="table" w:default="1" w:styleId="Tablanormal">

</xml_diff>